<commit_message>
refactor: humanizar identificadores a id_trabajador e id_cliente en PPT, Word, informe y scripts SQL
</commit_message>
<xml_diff>
--- a/INFORME_EP2_ESTILO_URBANO.docx
+++ b/INFORME_EP2_ESTILO_URBANO.docx
@@ -5,7 +5,7 @@
     <w:p>
       <w:pPr>
         <w:jc w:val="center"/>
-        <w:divId w:val="202058421"/>
+        <w:divId w:val="186993386"/>
         <w:rPr>
           <w:rFonts w:ascii="Calibri" w:eastAsia="Times New Roman" w:hAnsi="Calibri" w:cs="Calibri"/>
           <w:b/>
@@ -36,7 +36,7 @@
     <w:p>
       <w:pPr>
         <w:jc w:val="center"/>
-        <w:divId w:val="1982340410"/>
+        <w:divId w:val="360084558"/>
         <w:rPr>
           <w:rFonts w:ascii="Calibri" w:eastAsia="Times New Roman" w:hAnsi="Calibri" w:cs="Calibri"/>
           <w:color w:val="4B5563"/>
@@ -65,7 +65,7 @@
       <w:pPr>
         <w:shd w:val="clear" w:color="auto" w:fill="002B49"/>
         <w:jc w:val="center"/>
-        <w:divId w:val="1147042628"/>
+        <w:divId w:val="1903715570"/>
         <w:rPr>
           <w:rFonts w:ascii="Calibri" w:eastAsia="Times New Roman" w:hAnsi="Calibri" w:cs="Calibri"/>
           <w:b/>
@@ -94,7 +94,7 @@
     <w:p>
       <w:pPr>
         <w:jc w:val="center"/>
-        <w:divId w:val="500125725"/>
+        <w:divId w:val="915818037"/>
         <w:rPr>
           <w:rFonts w:ascii="Calibri" w:eastAsia="Times New Roman" w:hAnsi="Calibri" w:cs="Calibri"/>
           <w:b/>
@@ -121,7 +121,7 @@
     <w:p>
       <w:pPr>
         <w:jc w:val="center"/>
-        <w:divId w:val="81221042"/>
+        <w:divId w:val="1907379660"/>
         <w:rPr>
           <w:rFonts w:ascii="Calibri" w:eastAsia="Times New Roman" w:hAnsi="Calibri" w:cs="Calibri"/>
           <w:b/>
@@ -162,7 +162,7 @@
       </w:tblGrid>
       <w:tr>
         <w:trPr>
-          <w:divId w:val="2037463867"/>
+          <w:divId w:val="942111934"/>
         </w:trPr>
         <w:tc>
           <w:tcPr>
@@ -247,7 +247,7 @@
       </w:tr>
       <w:tr>
         <w:trPr>
-          <w:divId w:val="2037463867"/>
+          <w:divId w:val="942111934"/>
         </w:trPr>
         <w:tc>
           <w:tcPr>
@@ -332,7 +332,7 @@
       </w:tr>
       <w:tr>
         <w:trPr>
-          <w:divId w:val="2037463867"/>
+          <w:divId w:val="942111934"/>
         </w:trPr>
         <w:tc>
           <w:tcPr>
@@ -417,7 +417,7 @@
       </w:tr>
       <w:tr>
         <w:trPr>
-          <w:divId w:val="2037463867"/>
+          <w:divId w:val="942111934"/>
         </w:trPr>
         <w:tc>
           <w:tcPr>
@@ -503,7 +503,7 @@
       </w:tr>
       <w:tr>
         <w:trPr>
-          <w:divId w:val="2037463867"/>
+          <w:divId w:val="942111934"/>
         </w:trPr>
         <w:tc>
           <w:tcPr>
@@ -588,7 +588,7 @@
       </w:tr>
       <w:tr>
         <w:trPr>
-          <w:divId w:val="2037463867"/>
+          <w:divId w:val="942111934"/>
         </w:trPr>
         <w:tc>
           <w:tcPr>
@@ -673,7 +673,7 @@
       </w:tr>
       <w:tr>
         <w:trPr>
-          <w:divId w:val="2037463867"/>
+          <w:divId w:val="942111934"/>
         </w:trPr>
         <w:tc>
           <w:tcPr>
@@ -758,7 +758,7 @@
       </w:tr>
       <w:tr>
         <w:trPr>
-          <w:divId w:val="2037463867"/>
+          <w:divId w:val="942111934"/>
         </w:trPr>
         <w:tc>
           <w:tcPr>
@@ -845,7 +845,7 @@
     <w:p>
       <w:pPr>
         <w:jc w:val="center"/>
-        <w:divId w:val="1579946802"/>
+        <w:divId w:val="1035275884"/>
         <w:rPr>
           <w:rFonts w:ascii="Calibri" w:eastAsia="Times New Roman" w:hAnsi="Calibri" w:cs="Calibri"/>
           <w:color w:val="6B7280"/>
@@ -2913,36 +2913,36 @@
           <w:shd w:val="clear" w:color="auto" w:fill="F1F5F9"/>
           <w:lang w:val="es-ES"/>
         </w:rPr>
-        <w:t xml:space="preserve">    p_id_usuario   IN NUMBER,</w:t>
-      </w:r>
-    </w:p>
-    <w:p>
-      <w:pPr>
-        <w:pStyle w:val="HTMLconformatoprevio"/>
-        <w:pBdr>
-          <w:left w:val="single" w:sz="24" w:space="12" w:color="F59E0B"/>
-        </w:pBdr>
-        <w:shd w:val="clear" w:color="auto" w:fill="0F172A"/>
-        <w:spacing w:before="120" w:after="210"/>
-        <w:rPr>
-          <w:rFonts w:ascii="Consolas" w:hAnsi="Consolas"/>
-          <w:color w:val="0F52BA"/>
-          <w:sz w:val="19"/>
-          <w:szCs w:val="19"/>
-          <w:shd w:val="clear" w:color="auto" w:fill="F1F5F9"/>
-          <w:lang w:val="es-ES"/>
-        </w:rPr>
-      </w:pPr>
-      <w:r>
-        <w:rPr>
-          <w:rFonts w:ascii="Consolas" w:hAnsi="Consolas"/>
-          <w:color w:val="0F52BA"/>
-          <w:sz w:val="19"/>
-          <w:szCs w:val="19"/>
-          <w:shd w:val="clear" w:color="auto" w:fill="F1F5F9"/>
-          <w:lang w:val="es-ES"/>
-        </w:rPr>
-        <w:t xml:space="preserve">    p_nuevo_sueldo IN NUMBER</w:t>
+        <w:t xml:space="preserve">    p_id_trabajador IN NUMBER,</w:t>
+      </w:r>
+    </w:p>
+    <w:p>
+      <w:pPr>
+        <w:pStyle w:val="HTMLconformatoprevio"/>
+        <w:pBdr>
+          <w:left w:val="single" w:sz="24" w:space="12" w:color="F59E0B"/>
+        </w:pBdr>
+        <w:shd w:val="clear" w:color="auto" w:fill="0F172A"/>
+        <w:spacing w:before="120" w:after="210"/>
+        <w:rPr>
+          <w:rFonts w:ascii="Consolas" w:hAnsi="Consolas"/>
+          <w:color w:val="0F52BA"/>
+          <w:sz w:val="19"/>
+          <w:szCs w:val="19"/>
+          <w:shd w:val="clear" w:color="auto" w:fill="F1F5F9"/>
+          <w:lang w:val="es-ES"/>
+        </w:rPr>
+      </w:pPr>
+      <w:r>
+        <w:rPr>
+          <w:rFonts w:ascii="Consolas" w:hAnsi="Consolas"/>
+          <w:color w:val="0F52BA"/>
+          <w:sz w:val="19"/>
+          <w:szCs w:val="19"/>
+          <w:shd w:val="clear" w:color="auto" w:fill="F1F5F9"/>
+          <w:lang w:val="es-ES"/>
+        </w:rPr>
+        <w:t xml:space="preserve">    p_nuevo_sueldo  IN NUMBER</w:t>
       </w:r>
     </w:p>
     <w:p>
@@ -3029,36 +3029,36 @@
           <w:shd w:val="clear" w:color="auto" w:fill="F1F5F9"/>
           <w:lang w:val="es-ES"/>
         </w:rPr>
-        <w:t xml:space="preserve">    IF NOT fn_es_trabajador_valido(p_id_usuario) THEN</w:t>
-      </w:r>
-    </w:p>
-    <w:p>
-      <w:pPr>
-        <w:pStyle w:val="HTMLconformatoprevio"/>
-        <w:pBdr>
-          <w:left w:val="single" w:sz="24" w:space="12" w:color="F59E0B"/>
-        </w:pBdr>
-        <w:shd w:val="clear" w:color="auto" w:fill="0F172A"/>
-        <w:spacing w:before="120" w:after="210"/>
-        <w:rPr>
-          <w:rFonts w:ascii="Consolas" w:hAnsi="Consolas"/>
-          <w:color w:val="0F52BA"/>
-          <w:sz w:val="19"/>
-          <w:szCs w:val="19"/>
-          <w:shd w:val="clear" w:color="auto" w:fill="F1F5F9"/>
-          <w:lang w:val="es-ES"/>
-        </w:rPr>
-      </w:pPr>
-      <w:r>
-        <w:rPr>
-          <w:rFonts w:ascii="Consolas" w:hAnsi="Consolas"/>
-          <w:color w:val="0F52BA"/>
-          <w:sz w:val="19"/>
-          <w:szCs w:val="19"/>
-          <w:shd w:val="clear" w:color="auto" w:fill="F1F5F9"/>
-          <w:lang w:val="es-ES"/>
-        </w:rPr>
-        <w:t xml:space="preserve">        DBMS_OUTPUT.PUT_LINE('AVISO: El usuario ' || p_id_usuario || ' no es un trabajador activo.');</w:t>
+        <w:t xml:space="preserve">    IF NOT fn_es_trabajador_valido(p_id_trabajador) THEN</w:t>
+      </w:r>
+    </w:p>
+    <w:p>
+      <w:pPr>
+        <w:pStyle w:val="HTMLconformatoprevio"/>
+        <w:pBdr>
+          <w:left w:val="single" w:sz="24" w:space="12" w:color="F59E0B"/>
+        </w:pBdr>
+        <w:shd w:val="clear" w:color="auto" w:fill="0F172A"/>
+        <w:spacing w:before="120" w:after="210"/>
+        <w:rPr>
+          <w:rFonts w:ascii="Consolas" w:hAnsi="Consolas"/>
+          <w:color w:val="0F52BA"/>
+          <w:sz w:val="19"/>
+          <w:szCs w:val="19"/>
+          <w:shd w:val="clear" w:color="auto" w:fill="F1F5F9"/>
+          <w:lang w:val="es-ES"/>
+        </w:rPr>
+      </w:pPr>
+      <w:r>
+        <w:rPr>
+          <w:rFonts w:ascii="Consolas" w:hAnsi="Consolas"/>
+          <w:color w:val="0F52BA"/>
+          <w:sz w:val="19"/>
+          <w:szCs w:val="19"/>
+          <w:shd w:val="clear" w:color="auto" w:fill="F1F5F9"/>
+          <w:lang w:val="es-ES"/>
+        </w:rPr>
+        <w:t xml:space="preserve">        DBMS_OUTPUT.PUT_LINE('AVISO: El ID ' || p_id_trabajador || ' no corresponde a un trabajador activo.');</w:t>
       </w:r>
     </w:p>
     <w:p>
@@ -3232,7 +3232,7 @@
           <w:shd w:val="clear" w:color="auto" w:fill="F1F5F9"/>
           <w:lang w:val="es-ES"/>
         </w:rPr>
-        <w:t>WHERE id_usuario = p_id_usuario;</w:t>
+        <w:t>WHERE id_usuario = p_id_trabajador;</w:t>
       </w:r>
     </w:p>
     <w:p>
@@ -3308,7 +3308,7 @@
           <w:shd w:val="clear" w:color="auto" w:fill="F1F5F9"/>
           <w:lang w:val="es-ES"/>
         </w:rPr>
-        <w:t xml:space="preserve">    DBMS_OUTPUT.PUT_LINE('Sueldo de usuario ' || p_id_usuario || ' actualizado a $' || p_nuevo_sueldo);</w:t>
+        <w:t xml:space="preserve">    DBMS_OUTPUT.PUT_LINE('Sueldo de trabajador ' || p_id_trabajador || ' actualizado a $' || p_nuevo_sueldo);</w:t>
       </w:r>
     </w:p>
     <w:p>
@@ -5082,76 +5082,76 @@
           <w:shd w:val="clear" w:color="auto" w:fill="F1F5F9"/>
           <w:lang w:val="es-ES"/>
         </w:rPr>
-        <w:t xml:space="preserve">    PROCEDURE sp_actualizar_sueldo_empleado(p_id_usuario NUMBER, p_nuevo_sueldo NUMBER);</w:t>
-      </w:r>
-    </w:p>
-    <w:p>
-      <w:pPr>
-        <w:pStyle w:val="HTMLconformatoprevio"/>
-        <w:pBdr>
-          <w:left w:val="single" w:sz="24" w:space="12" w:color="F59E0B"/>
-        </w:pBdr>
-        <w:shd w:val="clear" w:color="auto" w:fill="0F172A"/>
-        <w:spacing w:before="120" w:after="210"/>
-        <w:rPr>
-          <w:rFonts w:ascii="Consolas" w:hAnsi="Consolas"/>
-          <w:color w:val="0F52BA"/>
-          <w:sz w:val="19"/>
-          <w:szCs w:val="19"/>
-          <w:shd w:val="clear" w:color="auto" w:fill="F1F5F9"/>
-          <w:lang w:val="es-ES"/>
-        </w:rPr>
-      </w:pPr>
-      <w:r>
-        <w:rPr>
-          <w:rFonts w:ascii="Consolas" w:hAnsi="Consolas"/>
-          <w:color w:val="0F52BA"/>
-          <w:sz w:val="19"/>
-          <w:szCs w:val="19"/>
-          <w:shd w:val="clear" w:color="auto" w:fill="F1F5F9"/>
-          <w:lang w:val="es-ES"/>
-        </w:rPr>
-        <w:t xml:space="preserve">    PROCEDURE sp_cambiar_estado_pedido(p_id_pedido NUMBER, p_nuevo_estado NUMBER);</w:t>
-      </w:r>
-    </w:p>
-    <w:p>
-      <w:pPr>
-        <w:pStyle w:val="HTMLconformatoprevio"/>
-        <w:pBdr>
-          <w:left w:val="single" w:sz="24" w:space="12" w:color="F59E0B"/>
-        </w:pBdr>
-        <w:shd w:val="clear" w:color="auto" w:fill="0F172A"/>
-        <w:spacing w:before="120" w:after="210"/>
-        <w:rPr>
-          <w:rFonts w:ascii="Consolas" w:hAnsi="Consolas"/>
-          <w:color w:val="0F52BA"/>
-          <w:sz w:val="19"/>
-          <w:szCs w:val="19"/>
-          <w:shd w:val="clear" w:color="auto" w:fill="F1F5F9"/>
-          <w:lang w:val="es-ES"/>
-        </w:rPr>
-      </w:pPr>
-      <w:r>
-        <w:rPr>
-          <w:rFonts w:ascii="Consolas" w:hAnsi="Consolas"/>
-          <w:color w:val="0F52BA"/>
-          <w:sz w:val="19"/>
-          <w:szCs w:val="19"/>
-          <w:shd w:val="clear" w:color="auto" w:fill="F1F5F9"/>
-          <w:lang w:val="es-ES"/>
-        </w:rPr>
-        <w:t xml:space="preserve"> </w:t>
-      </w:r>
-      <w:r>
-        <w:rPr>
-          <w:rFonts w:ascii="Consolas" w:hAnsi="Consolas"/>
-          <w:color w:val="0F52BA"/>
-          <w:sz w:val="19"/>
-          <w:szCs w:val="19"/>
-          <w:shd w:val="clear" w:color="auto" w:fill="F1F5F9"/>
-          <w:lang w:val="es-ES"/>
-        </w:rPr>
-        <w:t xml:space="preserve">   PROCEDURE sp_reajuste_masivo_sueldos;</w:t>
+        <w:t xml:space="preserve">    PROCEDURE sp_actualizar_sueldo_empleado(p_id_trabajador NUMBER, p_nuevo_sueldo NUMBER);</w:t>
+      </w:r>
+    </w:p>
+    <w:p>
+      <w:pPr>
+        <w:pStyle w:val="HTMLconformatoprevio"/>
+        <w:pBdr>
+          <w:left w:val="single" w:sz="24" w:space="12" w:color="F59E0B"/>
+        </w:pBdr>
+        <w:shd w:val="clear" w:color="auto" w:fill="0F172A"/>
+        <w:spacing w:before="120" w:after="210"/>
+        <w:rPr>
+          <w:rFonts w:ascii="Consolas" w:hAnsi="Consolas"/>
+          <w:color w:val="0F52BA"/>
+          <w:sz w:val="19"/>
+          <w:szCs w:val="19"/>
+          <w:shd w:val="clear" w:color="auto" w:fill="F1F5F9"/>
+          <w:lang w:val="es-ES"/>
+        </w:rPr>
+      </w:pPr>
+      <w:r>
+        <w:rPr>
+          <w:rFonts w:ascii="Consolas" w:hAnsi="Consolas"/>
+          <w:color w:val="0F52BA"/>
+          <w:sz w:val="19"/>
+          <w:szCs w:val="19"/>
+          <w:shd w:val="clear" w:color="auto" w:fill="F1F5F9"/>
+          <w:lang w:val="es-ES"/>
+        </w:rPr>
+        <w:t xml:space="preserve">    </w:t>
+      </w:r>
+      <w:r>
+        <w:rPr>
+          <w:rFonts w:ascii="Consolas" w:hAnsi="Consolas"/>
+          <w:color w:val="0F52BA"/>
+          <w:sz w:val="19"/>
+          <w:szCs w:val="19"/>
+          <w:shd w:val="clear" w:color="auto" w:fill="F1F5F9"/>
+          <w:lang w:val="es-ES"/>
+        </w:rPr>
+        <w:t>PROCEDURE sp_cambiar_estado_pedido(p_id_pedido NUMBER, p_nuevo_estado NUMBER);</w:t>
+      </w:r>
+    </w:p>
+    <w:p>
+      <w:pPr>
+        <w:pStyle w:val="HTMLconformatoprevio"/>
+        <w:pBdr>
+          <w:left w:val="single" w:sz="24" w:space="12" w:color="F59E0B"/>
+        </w:pBdr>
+        <w:shd w:val="clear" w:color="auto" w:fill="0F172A"/>
+        <w:spacing w:before="120" w:after="210"/>
+        <w:rPr>
+          <w:rFonts w:ascii="Consolas" w:hAnsi="Consolas"/>
+          <w:color w:val="0F52BA"/>
+          <w:sz w:val="19"/>
+          <w:szCs w:val="19"/>
+          <w:shd w:val="clear" w:color="auto" w:fill="F1F5F9"/>
+          <w:lang w:val="es-ES"/>
+        </w:rPr>
+      </w:pPr>
+      <w:r>
+        <w:rPr>
+          <w:rFonts w:ascii="Consolas" w:hAnsi="Consolas"/>
+          <w:color w:val="0F52BA"/>
+          <w:sz w:val="19"/>
+          <w:szCs w:val="19"/>
+          <w:shd w:val="clear" w:color="auto" w:fill="F1F5F9"/>
+          <w:lang w:val="es-ES"/>
+        </w:rPr>
+        <w:t xml:space="preserve">    PROCEDURE sp_reajuste_masivo_sueldos;</w:t>
       </w:r>
     </w:p>
     <w:p>
@@ -5310,6 +5310,75 @@
           <w:shd w:val="clear" w:color="auto" w:fill="F1F5F9"/>
           <w:lang w:val="es-ES"/>
         </w:rPr>
+        <w:t xml:space="preserve">    </w:t>
+      </w:r>
+      <w:r>
+        <w:rPr>
+          <w:rFonts w:ascii="Consolas" w:hAnsi="Consolas"/>
+          <w:color w:val="0F52BA"/>
+          <w:sz w:val="19"/>
+          <w:szCs w:val="19"/>
+          <w:shd w:val="clear" w:color="auto" w:fill="F1F5F9"/>
+          <w:lang w:val="es-ES"/>
+        </w:rPr>
+        <w:t>-- =========================================================================</w:t>
+      </w:r>
+    </w:p>
+    <w:p>
+      <w:pPr>
+        <w:pStyle w:val="HTMLconformatoprevio"/>
+        <w:pBdr>
+          <w:left w:val="single" w:sz="24" w:space="12" w:color="F59E0B"/>
+        </w:pBdr>
+        <w:shd w:val="clear" w:color="auto" w:fill="0F172A"/>
+        <w:spacing w:before="120" w:after="210"/>
+        <w:rPr>
+          <w:rFonts w:ascii="Consolas" w:hAnsi="Consolas"/>
+          <w:color w:val="0F52BA"/>
+          <w:sz w:val="19"/>
+          <w:szCs w:val="19"/>
+          <w:shd w:val="clear" w:color="auto" w:fill="F1F5F9"/>
+          <w:lang w:val="es-ES"/>
+        </w:rPr>
+      </w:pPr>
+      <w:r>
+        <w:rPr>
+          <w:rFonts w:ascii="Consolas" w:hAnsi="Consolas"/>
+          <w:color w:val="0F52BA"/>
+          <w:sz w:val="19"/>
+          <w:szCs w:val="19"/>
+          <w:shd w:val="clear" w:color="auto" w:fill="F1F5F9"/>
+          <w:lang w:val="es-ES"/>
+        </w:rPr>
+        <w:t xml:space="preserve">    -- CONSTRUCTOR PRIVADO (Oculto al exterior)</w:t>
+      </w:r>
+    </w:p>
+    <w:p>
+      <w:pPr>
+        <w:pStyle w:val="HTMLconformatoprevio"/>
+        <w:pBdr>
+          <w:left w:val="single" w:sz="24" w:space="12" w:color="F59E0B"/>
+        </w:pBdr>
+        <w:shd w:val="clear" w:color="auto" w:fill="0F172A"/>
+        <w:spacing w:before="120" w:after="210"/>
+        <w:rPr>
+          <w:rFonts w:ascii="Consolas" w:hAnsi="Consolas"/>
+          <w:color w:val="0F52BA"/>
+          <w:sz w:val="19"/>
+          <w:szCs w:val="19"/>
+          <w:shd w:val="clear" w:color="auto" w:fill="F1F5F9"/>
+          <w:lang w:val="es-ES"/>
+        </w:rPr>
+      </w:pPr>
+      <w:r>
+        <w:rPr>
+          <w:rFonts w:ascii="Consolas" w:hAnsi="Consolas"/>
+          <w:color w:val="0F52BA"/>
+          <w:sz w:val="19"/>
+          <w:szCs w:val="19"/>
+          <w:shd w:val="clear" w:color="auto" w:fill="F1F5F9"/>
+          <w:lang w:val="es-ES"/>
+        </w:rPr>
         <w:t xml:space="preserve">    -- =========================================================================</w:t>
       </w:r>
     </w:p>
@@ -5339,6 +5408,285 @@
           <w:shd w:val="clear" w:color="auto" w:fill="F1F5F9"/>
           <w:lang w:val="es-ES"/>
         </w:rPr>
+        <w:t xml:space="preserve">    FUNCTION fn_es_trabajador_valido(p_id_trabajador NUMBER) RETURN BOOLEAN IS</w:t>
+      </w:r>
+    </w:p>
+    <w:p>
+      <w:pPr>
+        <w:pStyle w:val="HTMLconformatoprevio"/>
+        <w:pBdr>
+          <w:left w:val="single" w:sz="24" w:space="12" w:color="F59E0B"/>
+        </w:pBdr>
+        <w:shd w:val="clear" w:color="auto" w:fill="0F172A"/>
+        <w:spacing w:before="120" w:after="210"/>
+        <w:rPr>
+          <w:rFonts w:ascii="Consolas" w:hAnsi="Consolas"/>
+          <w:color w:val="0F52BA"/>
+          <w:sz w:val="19"/>
+          <w:szCs w:val="19"/>
+          <w:shd w:val="clear" w:color="auto" w:fill="F1F5F9"/>
+          <w:lang w:val="es-ES"/>
+        </w:rPr>
+      </w:pPr>
+      <w:r>
+        <w:rPr>
+          <w:rFonts w:ascii="Consolas" w:hAnsi="Consolas"/>
+          <w:color w:val="0F52BA"/>
+          <w:sz w:val="19"/>
+          <w:szCs w:val="19"/>
+          <w:shd w:val="clear" w:color="auto" w:fill="F1F5F9"/>
+          <w:lang w:val="es-ES"/>
+        </w:rPr>
+        <w:t xml:space="preserve">        v_count NUMBER;</w:t>
+      </w:r>
+    </w:p>
+    <w:p>
+      <w:pPr>
+        <w:pStyle w:val="HTMLconformatoprevio"/>
+        <w:pBdr>
+          <w:left w:val="single" w:sz="24" w:space="12" w:color="F59E0B"/>
+        </w:pBdr>
+        <w:shd w:val="clear" w:color="auto" w:fill="0F172A"/>
+        <w:spacing w:before="120" w:after="210"/>
+        <w:rPr>
+          <w:rFonts w:ascii="Consolas" w:hAnsi="Consolas"/>
+          <w:color w:val="0F52BA"/>
+          <w:sz w:val="19"/>
+          <w:szCs w:val="19"/>
+          <w:shd w:val="clear" w:color="auto" w:fill="F1F5F9"/>
+          <w:lang w:val="es-ES"/>
+        </w:rPr>
+      </w:pPr>
+      <w:r>
+        <w:rPr>
+          <w:rFonts w:ascii="Consolas" w:hAnsi="Consolas"/>
+          <w:color w:val="0F52BA"/>
+          <w:sz w:val="19"/>
+          <w:szCs w:val="19"/>
+          <w:shd w:val="clear" w:color="auto" w:fill="F1F5F9"/>
+          <w:lang w:val="es-ES"/>
+        </w:rPr>
+        <w:t xml:space="preserve">    BEGIN</w:t>
+      </w:r>
+    </w:p>
+    <w:p>
+      <w:pPr>
+        <w:pStyle w:val="HTMLconformatoprevio"/>
+        <w:pBdr>
+          <w:left w:val="single" w:sz="24" w:space="12" w:color="F59E0B"/>
+        </w:pBdr>
+        <w:shd w:val="clear" w:color="auto" w:fill="0F172A"/>
+        <w:spacing w:before="120" w:after="210"/>
+        <w:rPr>
+          <w:rFonts w:ascii="Consolas" w:hAnsi="Consolas"/>
+          <w:color w:val="0F52BA"/>
+          <w:sz w:val="19"/>
+          <w:szCs w:val="19"/>
+          <w:shd w:val="clear" w:color="auto" w:fill="F1F5F9"/>
+          <w:lang w:val="es-ES"/>
+        </w:rPr>
+      </w:pPr>
+      <w:r>
+        <w:rPr>
+          <w:rFonts w:ascii="Consolas" w:hAnsi="Consolas"/>
+          <w:color w:val="0F52BA"/>
+          <w:sz w:val="19"/>
+          <w:szCs w:val="19"/>
+          <w:shd w:val="clear" w:color="auto" w:fill="F1F5F9"/>
+          <w:lang w:val="es-ES"/>
+        </w:rPr>
+        <w:t xml:space="preserve">        SELECT COUNT(*) INTO v_count</w:t>
+      </w:r>
+    </w:p>
+    <w:p>
+      <w:pPr>
+        <w:pStyle w:val="HTMLconformatoprevio"/>
+        <w:pBdr>
+          <w:left w:val="single" w:sz="24" w:space="12" w:color="F59E0B"/>
+        </w:pBdr>
+        <w:shd w:val="clear" w:color="auto" w:fill="0F172A"/>
+        <w:spacing w:before="120" w:after="210"/>
+        <w:rPr>
+          <w:rFonts w:ascii="Consolas" w:hAnsi="Consolas"/>
+          <w:color w:val="0F52BA"/>
+          <w:sz w:val="19"/>
+          <w:szCs w:val="19"/>
+          <w:shd w:val="clear" w:color="auto" w:fill="F1F5F9"/>
+          <w:lang w:val="es-ES"/>
+        </w:rPr>
+      </w:pPr>
+      <w:r>
+        <w:rPr>
+          <w:rFonts w:ascii="Consolas" w:hAnsi="Consolas"/>
+          <w:color w:val="0F52BA"/>
+          <w:sz w:val="19"/>
+          <w:szCs w:val="19"/>
+          <w:shd w:val="clear" w:color="auto" w:fill="F1F5F9"/>
+          <w:lang w:val="es-ES"/>
+        </w:rPr>
+        <w:t xml:space="preserve">        FROM USUARIO</w:t>
+      </w:r>
+    </w:p>
+    <w:p>
+      <w:pPr>
+        <w:pStyle w:val="HTMLconformatoprevio"/>
+        <w:pBdr>
+          <w:left w:val="single" w:sz="24" w:space="12" w:color="F59E0B"/>
+        </w:pBdr>
+        <w:shd w:val="clear" w:color="auto" w:fill="0F172A"/>
+        <w:spacing w:before="120" w:after="210"/>
+        <w:rPr>
+          <w:rFonts w:ascii="Consolas" w:hAnsi="Consolas"/>
+          <w:color w:val="0F52BA"/>
+          <w:sz w:val="19"/>
+          <w:szCs w:val="19"/>
+          <w:shd w:val="clear" w:color="auto" w:fill="F1F5F9"/>
+          <w:lang w:val="es-ES"/>
+        </w:rPr>
+      </w:pPr>
+      <w:r>
+        <w:rPr>
+          <w:rFonts w:ascii="Consolas" w:hAnsi="Consolas"/>
+          <w:color w:val="0F52BA"/>
+          <w:sz w:val="19"/>
+          <w:szCs w:val="19"/>
+          <w:shd w:val="clear" w:color="auto" w:fill="F1F5F9"/>
+          <w:lang w:val="es-ES"/>
+        </w:rPr>
+        <w:t xml:space="preserve">        WHERE id_usuario = p_id_trabajador </w:t>
+      </w:r>
+    </w:p>
+    <w:p>
+      <w:pPr>
+        <w:pStyle w:val="HTMLconformatoprevio"/>
+        <w:pBdr>
+          <w:left w:val="single" w:sz="24" w:space="12" w:color="F59E0B"/>
+        </w:pBdr>
+        <w:shd w:val="clear" w:color="auto" w:fill="0F172A"/>
+        <w:spacing w:before="120" w:after="210"/>
+        <w:rPr>
+          <w:rFonts w:ascii="Consolas" w:hAnsi="Consolas"/>
+          <w:color w:val="0F52BA"/>
+          <w:sz w:val="19"/>
+          <w:szCs w:val="19"/>
+          <w:shd w:val="clear" w:color="auto" w:fill="F1F5F9"/>
+          <w:lang w:val="es-ES"/>
+        </w:rPr>
+      </w:pPr>
+      <w:r>
+        <w:rPr>
+          <w:rFonts w:ascii="Consolas" w:hAnsi="Consolas"/>
+          <w:color w:val="0F52BA"/>
+          <w:sz w:val="19"/>
+          <w:szCs w:val="19"/>
+          <w:shd w:val="clear" w:color="auto" w:fill="F1F5F9"/>
+          <w:lang w:val="es-ES"/>
+        </w:rPr>
+        <w:t xml:space="preserve">          AND id_rol = 2 </w:t>
+      </w:r>
+    </w:p>
+    <w:p>
+      <w:pPr>
+        <w:pStyle w:val="HTMLconformatoprevio"/>
+        <w:pBdr>
+          <w:left w:val="single" w:sz="24" w:space="12" w:color="F59E0B"/>
+        </w:pBdr>
+        <w:shd w:val="clear" w:color="auto" w:fill="0F172A"/>
+        <w:spacing w:before="120" w:after="210"/>
+        <w:rPr>
+          <w:rFonts w:ascii="Consolas" w:hAnsi="Consolas"/>
+          <w:color w:val="0F52BA"/>
+          <w:sz w:val="19"/>
+          <w:szCs w:val="19"/>
+          <w:shd w:val="clear" w:color="auto" w:fill="F1F5F9"/>
+          <w:lang w:val="es-ES"/>
+        </w:rPr>
+      </w:pPr>
+      <w:r>
+        <w:rPr>
+          <w:rFonts w:ascii="Consolas" w:hAnsi="Consolas"/>
+          <w:color w:val="0F52BA"/>
+          <w:sz w:val="19"/>
+          <w:szCs w:val="19"/>
+          <w:shd w:val="clear" w:color="auto" w:fill="F1F5F9"/>
+          <w:lang w:val="es-ES"/>
+        </w:rPr>
+        <w:t xml:space="preserve">          AND estado = 'A';</w:t>
+      </w:r>
+    </w:p>
+    <w:p>
+      <w:pPr>
+        <w:pStyle w:val="HTMLconformatoprevio"/>
+        <w:pBdr>
+          <w:left w:val="single" w:sz="24" w:space="12" w:color="F59E0B"/>
+        </w:pBdr>
+        <w:shd w:val="clear" w:color="auto" w:fill="0F172A"/>
+        <w:spacing w:before="120" w:after="210"/>
+        <w:rPr>
+          <w:rFonts w:ascii="Consolas" w:hAnsi="Consolas"/>
+          <w:color w:val="0F52BA"/>
+          <w:sz w:val="19"/>
+          <w:szCs w:val="19"/>
+          <w:shd w:val="clear" w:color="auto" w:fill="F1F5F9"/>
+          <w:lang w:val="es-ES"/>
+        </w:rPr>
+      </w:pPr>
+    </w:p>
+    <w:p>
+      <w:pPr>
+        <w:pStyle w:val="HTMLconformatoprevio"/>
+        <w:pBdr>
+          <w:left w:val="single" w:sz="24" w:space="12" w:color="F59E0B"/>
+        </w:pBdr>
+        <w:shd w:val="clear" w:color="auto" w:fill="0F172A"/>
+        <w:spacing w:before="120" w:after="210"/>
+        <w:rPr>
+          <w:rFonts w:ascii="Consolas" w:hAnsi="Consolas"/>
+          <w:color w:val="0F52BA"/>
+          <w:sz w:val="19"/>
+          <w:szCs w:val="19"/>
+          <w:shd w:val="clear" w:color="auto" w:fill="F1F5F9"/>
+          <w:lang w:val="es-ES"/>
+        </w:rPr>
+      </w:pPr>
+      <w:r>
+        <w:rPr>
+          <w:rFonts w:ascii="Consolas" w:hAnsi="Consolas"/>
+          <w:color w:val="0F52BA"/>
+          <w:sz w:val="19"/>
+          <w:szCs w:val="19"/>
+          <w:shd w:val="clear" w:color="auto" w:fill="F1F5F9"/>
+          <w:lang w:val="es-ES"/>
+        </w:rPr>
+        <w:t xml:space="preserve">        RETURN (v_count &gt; 0);</w:t>
+      </w:r>
+    </w:p>
+    <w:p>
+      <w:pPr>
+        <w:pStyle w:val="HTMLconformatoprevio"/>
+        <w:pBdr>
+          <w:left w:val="single" w:sz="24" w:space="12" w:color="F59E0B"/>
+        </w:pBdr>
+        <w:shd w:val="clear" w:color="auto" w:fill="0F172A"/>
+        <w:spacing w:before="120" w:after="210"/>
+        <w:rPr>
+          <w:rFonts w:ascii="Consolas" w:hAnsi="Consolas"/>
+          <w:color w:val="0F52BA"/>
+          <w:sz w:val="19"/>
+          <w:szCs w:val="19"/>
+          <w:shd w:val="clear" w:color="auto" w:fill="F1F5F9"/>
+          <w:lang w:val="es-ES"/>
+        </w:rPr>
+      </w:pPr>
+      <w:r>
+        <w:rPr>
+          <w:rFonts w:ascii="Consolas" w:hAnsi="Consolas"/>
+          <w:color w:val="0F52BA"/>
+          <w:sz w:val="19"/>
+          <w:szCs w:val="19"/>
+          <w:shd w:val="clear" w:color="auto" w:fill="F1F5F9"/>
+          <w:lang w:val="es-ES"/>
+        </w:rPr>
         <w:t xml:space="preserve">    </w:t>
       </w:r>
       <w:r>
@@ -5350,402 +5698,54 @@
           <w:shd w:val="clear" w:color="auto" w:fill="F1F5F9"/>
           <w:lang w:val="es-ES"/>
         </w:rPr>
-        <w:t>-- CONSTRUCTOR PRIVADO (Oculto al exterior)</w:t>
-      </w:r>
-    </w:p>
-    <w:p>
-      <w:pPr>
-        <w:pStyle w:val="HTMLconformatoprevio"/>
-        <w:pBdr>
-          <w:left w:val="single" w:sz="24" w:space="12" w:color="F59E0B"/>
-        </w:pBdr>
-        <w:shd w:val="clear" w:color="auto" w:fill="0F172A"/>
-        <w:spacing w:before="120" w:after="210"/>
-        <w:rPr>
-          <w:rFonts w:ascii="Consolas" w:hAnsi="Consolas"/>
-          <w:color w:val="0F52BA"/>
-          <w:sz w:val="19"/>
-          <w:szCs w:val="19"/>
-          <w:shd w:val="clear" w:color="auto" w:fill="F1F5F9"/>
-          <w:lang w:val="es-ES"/>
-        </w:rPr>
-      </w:pPr>
-      <w:r>
-        <w:rPr>
-          <w:rFonts w:ascii="Consolas" w:hAnsi="Consolas"/>
-          <w:color w:val="0F52BA"/>
-          <w:sz w:val="19"/>
-          <w:szCs w:val="19"/>
-          <w:shd w:val="clear" w:color="auto" w:fill="F1F5F9"/>
-          <w:lang w:val="es-ES"/>
-        </w:rPr>
-        <w:t xml:space="preserve">    -- =========================================================================</w:t>
-      </w:r>
-    </w:p>
-    <w:p>
-      <w:pPr>
-        <w:pStyle w:val="HTMLconformatoprevio"/>
-        <w:pBdr>
-          <w:left w:val="single" w:sz="24" w:space="12" w:color="F59E0B"/>
-        </w:pBdr>
-        <w:shd w:val="clear" w:color="auto" w:fill="0F172A"/>
-        <w:spacing w:before="120" w:after="210"/>
-        <w:rPr>
-          <w:rFonts w:ascii="Consolas" w:hAnsi="Consolas"/>
-          <w:color w:val="0F52BA"/>
-          <w:sz w:val="19"/>
-          <w:szCs w:val="19"/>
-          <w:shd w:val="clear" w:color="auto" w:fill="F1F5F9"/>
-          <w:lang w:val="es-ES"/>
-        </w:rPr>
-      </w:pPr>
-      <w:r>
-        <w:rPr>
-          <w:rFonts w:ascii="Consolas" w:hAnsi="Consolas"/>
-          <w:color w:val="0F52BA"/>
-          <w:sz w:val="19"/>
-          <w:szCs w:val="19"/>
-          <w:shd w:val="clear" w:color="auto" w:fill="F1F5F9"/>
-          <w:lang w:val="es-ES"/>
-        </w:rPr>
-        <w:t xml:space="preserve">    FUNCTION fn_es_trabajador_valido(p_id_usuario NUMBER) RETURN BOOLEAN IS</w:t>
-      </w:r>
-    </w:p>
-    <w:p>
-      <w:pPr>
-        <w:pStyle w:val="HTMLconformatoprevio"/>
-        <w:pBdr>
-          <w:left w:val="single" w:sz="24" w:space="12" w:color="F59E0B"/>
-        </w:pBdr>
-        <w:shd w:val="clear" w:color="auto" w:fill="0F172A"/>
-        <w:spacing w:before="120" w:after="210"/>
-        <w:rPr>
-          <w:rFonts w:ascii="Consolas" w:hAnsi="Consolas"/>
-          <w:color w:val="0F52BA"/>
-          <w:sz w:val="19"/>
-          <w:szCs w:val="19"/>
-          <w:shd w:val="clear" w:color="auto" w:fill="F1F5F9"/>
-          <w:lang w:val="es-ES"/>
-        </w:rPr>
-      </w:pPr>
-      <w:r>
-        <w:rPr>
-          <w:rFonts w:ascii="Consolas" w:hAnsi="Consolas"/>
-          <w:color w:val="0F52BA"/>
-          <w:sz w:val="19"/>
-          <w:szCs w:val="19"/>
-          <w:shd w:val="clear" w:color="auto" w:fill="F1F5F9"/>
-          <w:lang w:val="es-ES"/>
-        </w:rPr>
-        <w:t xml:space="preserve">        v_count NUMBER;</w:t>
-      </w:r>
-    </w:p>
-    <w:p>
-      <w:pPr>
-        <w:pStyle w:val="HTMLconformatoprevio"/>
-        <w:pBdr>
-          <w:left w:val="single" w:sz="24" w:space="12" w:color="F59E0B"/>
-        </w:pBdr>
-        <w:shd w:val="clear" w:color="auto" w:fill="0F172A"/>
-        <w:spacing w:before="120" w:after="210"/>
-        <w:rPr>
-          <w:rFonts w:ascii="Consolas" w:hAnsi="Consolas"/>
-          <w:color w:val="0F52BA"/>
-          <w:sz w:val="19"/>
-          <w:szCs w:val="19"/>
-          <w:shd w:val="clear" w:color="auto" w:fill="F1F5F9"/>
-          <w:lang w:val="es-ES"/>
-        </w:rPr>
-      </w:pPr>
-      <w:r>
-        <w:rPr>
-          <w:rFonts w:ascii="Consolas" w:hAnsi="Consolas"/>
-          <w:color w:val="0F52BA"/>
-          <w:sz w:val="19"/>
-          <w:szCs w:val="19"/>
-          <w:shd w:val="clear" w:color="auto" w:fill="F1F5F9"/>
-          <w:lang w:val="es-ES"/>
-        </w:rPr>
-        <w:t xml:space="preserve">    BEGIN</w:t>
-      </w:r>
-    </w:p>
-    <w:p>
-      <w:pPr>
-        <w:pStyle w:val="HTMLconformatoprevio"/>
-        <w:pBdr>
-          <w:left w:val="single" w:sz="24" w:space="12" w:color="F59E0B"/>
-        </w:pBdr>
-        <w:shd w:val="clear" w:color="auto" w:fill="0F172A"/>
-        <w:spacing w:before="120" w:after="210"/>
-        <w:rPr>
-          <w:rFonts w:ascii="Consolas" w:hAnsi="Consolas"/>
-          <w:color w:val="0F52BA"/>
-          <w:sz w:val="19"/>
-          <w:szCs w:val="19"/>
-          <w:shd w:val="clear" w:color="auto" w:fill="F1F5F9"/>
-          <w:lang w:val="es-ES"/>
-        </w:rPr>
-      </w:pPr>
-      <w:r>
-        <w:rPr>
-          <w:rFonts w:ascii="Consolas" w:hAnsi="Consolas"/>
-          <w:color w:val="0F52BA"/>
-          <w:sz w:val="19"/>
-          <w:szCs w:val="19"/>
-          <w:shd w:val="clear" w:color="auto" w:fill="F1F5F9"/>
-          <w:lang w:val="es-ES"/>
-        </w:rPr>
-        <w:t xml:space="preserve">        SELECT COUNT(*) INTO v_count</w:t>
-      </w:r>
-    </w:p>
-    <w:p>
-      <w:pPr>
-        <w:pStyle w:val="HTMLconformatoprevio"/>
-        <w:pBdr>
-          <w:left w:val="single" w:sz="24" w:space="12" w:color="F59E0B"/>
-        </w:pBdr>
-        <w:shd w:val="clear" w:color="auto" w:fill="0F172A"/>
-        <w:spacing w:before="120" w:after="210"/>
-        <w:rPr>
-          <w:rFonts w:ascii="Consolas" w:hAnsi="Consolas"/>
-          <w:color w:val="0F52BA"/>
-          <w:sz w:val="19"/>
-          <w:szCs w:val="19"/>
-          <w:shd w:val="clear" w:color="auto" w:fill="F1F5F9"/>
-          <w:lang w:val="es-ES"/>
-        </w:rPr>
-      </w:pPr>
-      <w:r>
-        <w:rPr>
-          <w:rFonts w:ascii="Consolas" w:hAnsi="Consolas"/>
-          <w:color w:val="0F52BA"/>
-          <w:sz w:val="19"/>
-          <w:szCs w:val="19"/>
-          <w:shd w:val="clear" w:color="auto" w:fill="F1F5F9"/>
-          <w:lang w:val="es-ES"/>
-        </w:rPr>
-        <w:t xml:space="preserve">        FROM USUARIO</w:t>
-      </w:r>
-    </w:p>
-    <w:p>
-      <w:pPr>
-        <w:pStyle w:val="HTMLconformatoprevio"/>
-        <w:pBdr>
-          <w:left w:val="single" w:sz="24" w:space="12" w:color="F59E0B"/>
-        </w:pBdr>
-        <w:shd w:val="clear" w:color="auto" w:fill="0F172A"/>
-        <w:spacing w:before="120" w:after="210"/>
-        <w:rPr>
-          <w:rFonts w:ascii="Consolas" w:hAnsi="Consolas"/>
-          <w:color w:val="0F52BA"/>
-          <w:sz w:val="19"/>
-          <w:szCs w:val="19"/>
-          <w:shd w:val="clear" w:color="auto" w:fill="F1F5F9"/>
-          <w:lang w:val="es-ES"/>
-        </w:rPr>
-      </w:pPr>
-      <w:r>
-        <w:rPr>
-          <w:rFonts w:ascii="Consolas" w:hAnsi="Consolas"/>
-          <w:color w:val="0F52BA"/>
-          <w:sz w:val="19"/>
-          <w:szCs w:val="19"/>
-          <w:shd w:val="clear" w:color="auto" w:fill="F1F5F9"/>
-          <w:lang w:val="es-ES"/>
-        </w:rPr>
-        <w:t xml:space="preserve">        WHERE id_usuario = p_id_usuario </w:t>
-      </w:r>
-    </w:p>
-    <w:p>
-      <w:pPr>
-        <w:pStyle w:val="HTMLconformatoprevio"/>
-        <w:pBdr>
-          <w:left w:val="single" w:sz="24" w:space="12" w:color="F59E0B"/>
-        </w:pBdr>
-        <w:shd w:val="clear" w:color="auto" w:fill="0F172A"/>
-        <w:spacing w:before="120" w:after="210"/>
-        <w:rPr>
-          <w:rFonts w:ascii="Consolas" w:hAnsi="Consolas"/>
-          <w:color w:val="0F52BA"/>
-          <w:sz w:val="19"/>
-          <w:szCs w:val="19"/>
-          <w:shd w:val="clear" w:color="auto" w:fill="F1F5F9"/>
-          <w:lang w:val="es-ES"/>
-        </w:rPr>
-      </w:pPr>
-      <w:r>
-        <w:rPr>
-          <w:rFonts w:ascii="Consolas" w:hAnsi="Consolas"/>
-          <w:color w:val="0F52BA"/>
-          <w:sz w:val="19"/>
-          <w:szCs w:val="19"/>
-          <w:shd w:val="clear" w:color="auto" w:fill="F1F5F9"/>
-          <w:lang w:val="es-ES"/>
-        </w:rPr>
-        <w:t xml:space="preserve">          AND id_rol = 2 </w:t>
-      </w:r>
-    </w:p>
-    <w:p>
-      <w:pPr>
-        <w:pStyle w:val="HTMLconformatoprevio"/>
-        <w:pBdr>
-          <w:left w:val="single" w:sz="24" w:space="12" w:color="F59E0B"/>
-        </w:pBdr>
-        <w:shd w:val="clear" w:color="auto" w:fill="0F172A"/>
-        <w:spacing w:before="120" w:after="210"/>
-        <w:rPr>
-          <w:rFonts w:ascii="Consolas" w:hAnsi="Consolas"/>
-          <w:color w:val="0F52BA"/>
-          <w:sz w:val="19"/>
-          <w:szCs w:val="19"/>
-          <w:shd w:val="clear" w:color="auto" w:fill="F1F5F9"/>
-          <w:lang w:val="es-ES"/>
-        </w:rPr>
-      </w:pPr>
-      <w:r>
-        <w:rPr>
-          <w:rFonts w:ascii="Consolas" w:hAnsi="Consolas"/>
-          <w:color w:val="0F52BA"/>
-          <w:sz w:val="19"/>
-          <w:szCs w:val="19"/>
-          <w:shd w:val="clear" w:color="auto" w:fill="F1F5F9"/>
-          <w:lang w:val="es-ES"/>
-        </w:rPr>
-        <w:t xml:space="preserve">          AND estado = 'A';</w:t>
-      </w:r>
-    </w:p>
-    <w:p>
-      <w:pPr>
-        <w:pStyle w:val="HTMLconformatoprevio"/>
-        <w:pBdr>
-          <w:left w:val="single" w:sz="24" w:space="12" w:color="F59E0B"/>
-        </w:pBdr>
-        <w:shd w:val="clear" w:color="auto" w:fill="0F172A"/>
-        <w:spacing w:before="120" w:after="210"/>
-        <w:rPr>
-          <w:rFonts w:ascii="Consolas" w:hAnsi="Consolas"/>
-          <w:color w:val="0F52BA"/>
-          <w:sz w:val="19"/>
-          <w:szCs w:val="19"/>
-          <w:shd w:val="clear" w:color="auto" w:fill="F1F5F9"/>
-          <w:lang w:val="es-ES"/>
-        </w:rPr>
-      </w:pPr>
-    </w:p>
-    <w:p>
-      <w:pPr>
-        <w:pStyle w:val="HTMLconformatoprevio"/>
-        <w:pBdr>
-          <w:left w:val="single" w:sz="24" w:space="12" w:color="F59E0B"/>
-        </w:pBdr>
-        <w:shd w:val="clear" w:color="auto" w:fill="0F172A"/>
-        <w:spacing w:before="120" w:after="210"/>
-        <w:rPr>
-          <w:rFonts w:ascii="Consolas" w:hAnsi="Consolas"/>
-          <w:color w:val="0F52BA"/>
-          <w:sz w:val="19"/>
-          <w:szCs w:val="19"/>
-          <w:shd w:val="clear" w:color="auto" w:fill="F1F5F9"/>
-          <w:lang w:val="es-ES"/>
-        </w:rPr>
-      </w:pPr>
-      <w:r>
-        <w:rPr>
-          <w:rFonts w:ascii="Consolas" w:hAnsi="Consolas"/>
-          <w:color w:val="0F52BA"/>
-          <w:sz w:val="19"/>
-          <w:szCs w:val="19"/>
-          <w:shd w:val="clear" w:color="auto" w:fill="F1F5F9"/>
-          <w:lang w:val="es-ES"/>
-        </w:rPr>
-        <w:t xml:space="preserve">        RETURN (v_count &gt; 0);</w:t>
-      </w:r>
-    </w:p>
-    <w:p>
-      <w:pPr>
-        <w:pStyle w:val="HTMLconformatoprevio"/>
-        <w:pBdr>
-          <w:left w:val="single" w:sz="24" w:space="12" w:color="F59E0B"/>
-        </w:pBdr>
-        <w:shd w:val="clear" w:color="auto" w:fill="0F172A"/>
-        <w:spacing w:before="120" w:after="210"/>
-        <w:rPr>
-          <w:rFonts w:ascii="Consolas" w:hAnsi="Consolas"/>
-          <w:color w:val="0F52BA"/>
-          <w:sz w:val="19"/>
-          <w:szCs w:val="19"/>
-          <w:shd w:val="clear" w:color="auto" w:fill="F1F5F9"/>
-          <w:lang w:val="es-ES"/>
-        </w:rPr>
-      </w:pPr>
-      <w:r>
-        <w:rPr>
-          <w:rFonts w:ascii="Consolas" w:hAnsi="Consolas"/>
-          <w:color w:val="0F52BA"/>
-          <w:sz w:val="19"/>
-          <w:szCs w:val="19"/>
-          <w:shd w:val="clear" w:color="auto" w:fill="F1F5F9"/>
-          <w:lang w:val="es-ES"/>
-        </w:rPr>
-        <w:t xml:space="preserve">    END fn_es_trabajador_valido;</w:t>
-      </w:r>
-    </w:p>
-    <w:p>
-      <w:pPr>
-        <w:pStyle w:val="HTMLconformatoprevio"/>
-        <w:pBdr>
-          <w:left w:val="single" w:sz="24" w:space="12" w:color="F59E0B"/>
-        </w:pBdr>
-        <w:shd w:val="clear" w:color="auto" w:fill="0F172A"/>
-        <w:spacing w:before="120" w:after="210"/>
-        <w:rPr>
-          <w:rFonts w:ascii="Consolas" w:hAnsi="Consolas"/>
-          <w:color w:val="0F52BA"/>
-          <w:sz w:val="19"/>
-          <w:szCs w:val="19"/>
-          <w:shd w:val="clear" w:color="auto" w:fill="F1F5F9"/>
-          <w:lang w:val="es-ES"/>
-        </w:rPr>
-      </w:pPr>
-    </w:p>
-    <w:p>
-      <w:pPr>
-        <w:pStyle w:val="HTMLconformatoprevio"/>
-        <w:pBdr>
-          <w:left w:val="single" w:sz="24" w:space="12" w:color="F59E0B"/>
-        </w:pBdr>
-        <w:shd w:val="clear" w:color="auto" w:fill="0F172A"/>
-        <w:spacing w:before="120" w:after="210"/>
-        <w:rPr>
-          <w:rFonts w:ascii="Consolas" w:hAnsi="Consolas"/>
-          <w:color w:val="0F52BA"/>
-          <w:sz w:val="19"/>
-          <w:szCs w:val="19"/>
-          <w:shd w:val="clear" w:color="auto" w:fill="F1F5F9"/>
-          <w:lang w:val="es-ES"/>
-        </w:rPr>
-      </w:pPr>
-      <w:r>
-        <w:rPr>
-          <w:rFonts w:ascii="Consolas" w:hAnsi="Consolas"/>
-          <w:color w:val="0F52BA"/>
-          <w:sz w:val="19"/>
-          <w:szCs w:val="19"/>
-          <w:shd w:val="clear" w:color="auto" w:fill="F1F5F9"/>
-          <w:lang w:val="es-ES"/>
-        </w:rPr>
-        <w:t xml:space="preserve">    </w:t>
-      </w:r>
-      <w:r>
-        <w:rPr>
-          <w:rFonts w:ascii="Consolas" w:hAnsi="Consolas"/>
-          <w:color w:val="0F52BA"/>
-          <w:sz w:val="19"/>
-          <w:szCs w:val="19"/>
-          <w:shd w:val="clear" w:color="auto" w:fill="F1F5F9"/>
-          <w:lang w:val="es-ES"/>
-        </w:rPr>
-        <w:t>-- Los procedimientos públicos consumen fn_es_trabajador_valido</w:t>
+        <w:t>END fn_es_trabajador_valido;</w:t>
+      </w:r>
+    </w:p>
+    <w:p>
+      <w:pPr>
+        <w:pStyle w:val="HTMLconformatoprevio"/>
+        <w:pBdr>
+          <w:left w:val="single" w:sz="24" w:space="12" w:color="F59E0B"/>
+        </w:pBdr>
+        <w:shd w:val="clear" w:color="auto" w:fill="0F172A"/>
+        <w:spacing w:before="120" w:after="210"/>
+        <w:rPr>
+          <w:rFonts w:ascii="Consolas" w:hAnsi="Consolas"/>
+          <w:color w:val="0F52BA"/>
+          <w:sz w:val="19"/>
+          <w:szCs w:val="19"/>
+          <w:shd w:val="clear" w:color="auto" w:fill="F1F5F9"/>
+          <w:lang w:val="es-ES"/>
+        </w:rPr>
+      </w:pPr>
+    </w:p>
+    <w:p>
+      <w:pPr>
+        <w:pStyle w:val="HTMLconformatoprevio"/>
+        <w:pBdr>
+          <w:left w:val="single" w:sz="24" w:space="12" w:color="F59E0B"/>
+        </w:pBdr>
+        <w:shd w:val="clear" w:color="auto" w:fill="0F172A"/>
+        <w:spacing w:before="120" w:after="210"/>
+        <w:rPr>
+          <w:rFonts w:ascii="Consolas" w:hAnsi="Consolas"/>
+          <w:color w:val="0F52BA"/>
+          <w:sz w:val="19"/>
+          <w:szCs w:val="19"/>
+          <w:shd w:val="clear" w:color="auto" w:fill="F1F5F9"/>
+          <w:lang w:val="es-ES"/>
+        </w:rPr>
+      </w:pPr>
+      <w:r>
+        <w:rPr>
+          <w:rFonts w:ascii="Consolas" w:hAnsi="Consolas"/>
+          <w:color w:val="0F52BA"/>
+          <w:sz w:val="19"/>
+          <w:szCs w:val="19"/>
+          <w:shd w:val="clear" w:color="auto" w:fill="F1F5F9"/>
+          <w:lang w:val="es-ES"/>
+        </w:rPr>
+        <w:t xml:space="preserve">    -- Los procedimientos públicos consumen fn_es_trabajador_valido</w:t>
       </w:r>
     </w:p>
     <w:p>
@@ -5803,6 +5803,937 @@
           <w:lang w:val="es-ES"/>
         </w:rPr>
         <w:t>END PKG_ESTILO_URBANO;</w:t>
+      </w:r>
+    </w:p>
+    <w:p>
+      <w:pPr>
+        <w:pStyle w:val="Ttulo2"/>
+        <w:rPr>
+          <w:rFonts w:ascii="Calibri" w:eastAsia="Times New Roman" w:hAnsi="Calibri" w:cs="Calibri"/>
+          <w:lang w:val="es-ES"/>
+        </w:rPr>
+      </w:pPr>
+      <w:r>
+        <w:rPr>
+          <w:rFonts w:ascii="Calibri" w:eastAsia="Times New Roman" w:hAnsi="Calibri" w:cs="Calibri"/>
+          <w:lang w:val="es-ES"/>
+        </w:rPr>
+        <w:t>3.3 Vistas de Abstracción: Humanización del Modelo de Datos (V_TRABAJADORES y V_CLIENTES)</w:t>
+      </w:r>
+    </w:p>
+    <w:p>
+      <w:pPr>
+        <w:pStyle w:val="NormalWeb"/>
+        <w:rPr>
+          <w:rFonts w:ascii="Calibri" w:hAnsi="Calibri" w:cs="Calibri"/>
+          <w:color w:val="1F2937"/>
+          <w:sz w:val="22"/>
+          <w:szCs w:val="22"/>
+          <w:lang w:val="es-ES"/>
+        </w:rPr>
+      </w:pPr>
+      <w:r>
+        <w:rPr>
+          <w:rFonts w:ascii="Calibri" w:hAnsi="Calibri" w:cs="Calibri"/>
+          <w:color w:val="1F2937"/>
+          <w:sz w:val="22"/>
+          <w:szCs w:val="22"/>
+          <w:lang w:val="es-ES"/>
+        </w:rPr>
+        <w:t xml:space="preserve">Para superar la rigidez de la tabla técnica </w:t>
+      </w:r>
+      <w:r>
+        <w:rPr>
+          <w:rStyle w:val="CdigoHTML"/>
+          <w:lang w:val="es-ES"/>
+        </w:rPr>
+        <w:t>USUARIO</w:t>
+      </w:r>
+      <w:r>
+        <w:rPr>
+          <w:rFonts w:ascii="Calibri" w:hAnsi="Calibri" w:cs="Calibri"/>
+          <w:color w:val="1F2937"/>
+          <w:sz w:val="22"/>
+          <w:szCs w:val="22"/>
+          <w:lang w:val="es-ES"/>
+        </w:rPr>
+        <w:t xml:space="preserve"> (cuyo identificador </w:t>
+      </w:r>
+      <w:r>
+        <w:rPr>
+          <w:rStyle w:val="CdigoHTML"/>
+          <w:lang w:val="es-ES"/>
+        </w:rPr>
+        <w:t>id_usuario</w:t>
+      </w:r>
+      <w:r>
+        <w:rPr>
+          <w:rFonts w:ascii="Calibri" w:hAnsi="Calibri" w:cs="Calibri"/>
+          <w:color w:val="1F2937"/>
+          <w:sz w:val="22"/>
+          <w:szCs w:val="22"/>
+          <w:lang w:val="es-ES"/>
+        </w:rPr>
+        <w:t xml:space="preserve"> resulta genérico y poco representativo de los roles de negocio), se implementaron dos </w:t>
+      </w:r>
+      <w:r>
+        <w:rPr>
+          <w:rStyle w:val="Fuerte"/>
+          <w:rFonts w:ascii="Calibri" w:hAnsi="Calibri" w:cs="Calibri"/>
+          <w:color w:val="1F2937"/>
+          <w:sz w:val="22"/>
+          <w:szCs w:val="22"/>
+          <w:lang w:val="es-ES"/>
+        </w:rPr>
+        <w:t>Vistas de Abstracción</w:t>
+      </w:r>
+      <w:r>
+        <w:rPr>
+          <w:rFonts w:ascii="Calibri" w:hAnsi="Calibri" w:cs="Calibri"/>
+          <w:color w:val="1F2937"/>
+          <w:sz w:val="22"/>
+          <w:szCs w:val="22"/>
+          <w:lang w:val="es-ES"/>
+        </w:rPr>
+        <w:t xml:space="preserve">. Este diseño permite que las aplicaciones de Recursos Humanos y de Ventas operen directamente con conceptos humanos: </w:t>
+      </w:r>
+      <w:r>
+        <w:rPr>
+          <w:rStyle w:val="CdigoHTML"/>
+          <w:b/>
+          <w:bCs/>
+          <w:lang w:val="es-ES"/>
+        </w:rPr>
+        <w:t>id_trabajador</w:t>
+      </w:r>
+      <w:r>
+        <w:rPr>
+          <w:rFonts w:ascii="Calibri" w:hAnsi="Calibri" w:cs="Calibri"/>
+          <w:color w:val="1F2937"/>
+          <w:sz w:val="22"/>
+          <w:szCs w:val="22"/>
+          <w:lang w:val="es-ES"/>
+        </w:rPr>
+        <w:t xml:space="preserve"> para empleados y </w:t>
+      </w:r>
+      <w:r>
+        <w:rPr>
+          <w:rStyle w:val="CdigoHTML"/>
+          <w:b/>
+          <w:bCs/>
+          <w:lang w:val="es-ES"/>
+        </w:rPr>
+        <w:t>id_cliente</w:t>
+      </w:r>
+      <w:r>
+        <w:rPr>
+          <w:rFonts w:ascii="Calibri" w:hAnsi="Calibri" w:cs="Calibri"/>
+          <w:color w:val="1F2937"/>
+          <w:sz w:val="22"/>
+          <w:szCs w:val="22"/>
+          <w:lang w:val="es-ES"/>
+        </w:rPr>
+        <w:t xml:space="preserve"> para compradores. </w:t>
+      </w:r>
+    </w:p>
+    <w:p>
+      <w:pPr>
+        <w:pStyle w:val="HTMLconformatoprevio"/>
+        <w:pBdr>
+          <w:left w:val="single" w:sz="24" w:space="12" w:color="F59E0B"/>
+        </w:pBdr>
+        <w:shd w:val="clear" w:color="auto" w:fill="0F172A"/>
+        <w:spacing w:before="120" w:after="210"/>
+        <w:rPr>
+          <w:rFonts w:ascii="Consolas" w:hAnsi="Consolas"/>
+          <w:color w:val="0F52BA"/>
+          <w:sz w:val="19"/>
+          <w:szCs w:val="19"/>
+          <w:shd w:val="clear" w:color="auto" w:fill="F1F5F9"/>
+          <w:lang w:val="es-ES"/>
+        </w:rPr>
+      </w:pPr>
+      <w:r>
+        <w:rPr>
+          <w:rFonts w:ascii="Consolas" w:hAnsi="Consolas"/>
+          <w:color w:val="0F52BA"/>
+          <w:sz w:val="19"/>
+          <w:szCs w:val="19"/>
+          <w:shd w:val="clear" w:color="auto" w:fill="F1F5F9"/>
+          <w:lang w:val="es-ES"/>
+        </w:rPr>
+        <w:t>-- Vista exclusiva para Recursos Humanos (Trabajadores)</w:t>
+      </w:r>
+    </w:p>
+    <w:p>
+      <w:pPr>
+        <w:pStyle w:val="HTMLconformatoprevio"/>
+        <w:pBdr>
+          <w:left w:val="single" w:sz="24" w:space="12" w:color="F59E0B"/>
+        </w:pBdr>
+        <w:shd w:val="clear" w:color="auto" w:fill="0F172A"/>
+        <w:spacing w:before="120" w:after="210"/>
+        <w:rPr>
+          <w:rFonts w:ascii="Consolas" w:hAnsi="Consolas"/>
+          <w:color w:val="0F52BA"/>
+          <w:sz w:val="19"/>
+          <w:szCs w:val="19"/>
+          <w:shd w:val="clear" w:color="auto" w:fill="F1F5F9"/>
+          <w:lang w:val="es-ES"/>
+        </w:rPr>
+      </w:pPr>
+      <w:r>
+        <w:rPr>
+          <w:rFonts w:ascii="Consolas" w:hAnsi="Consolas"/>
+          <w:color w:val="0F52BA"/>
+          <w:sz w:val="19"/>
+          <w:szCs w:val="19"/>
+          <w:shd w:val="clear" w:color="auto" w:fill="F1F5F9"/>
+          <w:lang w:val="es-ES"/>
+        </w:rPr>
+        <w:t>CREATE OR REPLACE VIEW V_TRABAJADORES AS</w:t>
+      </w:r>
+    </w:p>
+    <w:p>
+      <w:pPr>
+        <w:pStyle w:val="HTMLconformatoprevio"/>
+        <w:pBdr>
+          <w:left w:val="single" w:sz="24" w:space="12" w:color="F59E0B"/>
+        </w:pBdr>
+        <w:shd w:val="clear" w:color="auto" w:fill="0F172A"/>
+        <w:spacing w:before="120" w:after="210"/>
+        <w:rPr>
+          <w:rFonts w:ascii="Consolas" w:hAnsi="Consolas"/>
+          <w:color w:val="0F52BA"/>
+          <w:sz w:val="19"/>
+          <w:szCs w:val="19"/>
+          <w:shd w:val="clear" w:color="auto" w:fill="F1F5F9"/>
+          <w:lang w:val="es-ES"/>
+        </w:rPr>
+      </w:pPr>
+      <w:r>
+        <w:rPr>
+          <w:rFonts w:ascii="Consolas" w:hAnsi="Consolas"/>
+          <w:color w:val="0F52BA"/>
+          <w:sz w:val="19"/>
+          <w:szCs w:val="19"/>
+          <w:shd w:val="clear" w:color="auto" w:fill="F1F5F9"/>
+          <w:lang w:val="es-ES"/>
+        </w:rPr>
+        <w:t xml:space="preserve">SELECT </w:t>
+      </w:r>
+    </w:p>
+    <w:p>
+      <w:pPr>
+        <w:pStyle w:val="HTMLconformatoprevio"/>
+        <w:pBdr>
+          <w:left w:val="single" w:sz="24" w:space="12" w:color="F59E0B"/>
+        </w:pBdr>
+        <w:shd w:val="clear" w:color="auto" w:fill="0F172A"/>
+        <w:spacing w:before="120" w:after="210"/>
+        <w:rPr>
+          <w:rFonts w:ascii="Consolas" w:hAnsi="Consolas"/>
+          <w:color w:val="0F52BA"/>
+          <w:sz w:val="19"/>
+          <w:szCs w:val="19"/>
+          <w:shd w:val="clear" w:color="auto" w:fill="F1F5F9"/>
+          <w:lang w:val="es-ES"/>
+        </w:rPr>
+      </w:pPr>
+      <w:r>
+        <w:rPr>
+          <w:rFonts w:ascii="Consolas" w:hAnsi="Consolas"/>
+          <w:color w:val="0F52BA"/>
+          <w:sz w:val="19"/>
+          <w:szCs w:val="19"/>
+          <w:shd w:val="clear" w:color="auto" w:fill="F1F5F9"/>
+          <w:lang w:val="es-ES"/>
+        </w:rPr>
+        <w:t xml:space="preserve">    id_usuario AS id_trabajador,</w:t>
+      </w:r>
+    </w:p>
+    <w:p>
+      <w:pPr>
+        <w:pStyle w:val="HTMLconformatoprevio"/>
+        <w:pBdr>
+          <w:left w:val="single" w:sz="24" w:space="12" w:color="F59E0B"/>
+        </w:pBdr>
+        <w:shd w:val="clear" w:color="auto" w:fill="0F172A"/>
+        <w:spacing w:before="120" w:after="210"/>
+        <w:rPr>
+          <w:rFonts w:ascii="Consolas" w:hAnsi="Consolas"/>
+          <w:color w:val="0F52BA"/>
+          <w:sz w:val="19"/>
+          <w:szCs w:val="19"/>
+          <w:shd w:val="clear" w:color="auto" w:fill="F1F5F9"/>
+          <w:lang w:val="es-ES"/>
+        </w:rPr>
+      </w:pPr>
+      <w:r>
+        <w:rPr>
+          <w:rFonts w:ascii="Consolas" w:hAnsi="Consolas"/>
+          <w:color w:val="0F52BA"/>
+          <w:sz w:val="19"/>
+          <w:szCs w:val="19"/>
+          <w:shd w:val="clear" w:color="auto" w:fill="F1F5F9"/>
+          <w:lang w:val="es-ES"/>
+        </w:rPr>
+        <w:t xml:space="preserve">    rut,</w:t>
+      </w:r>
+    </w:p>
+    <w:p>
+      <w:pPr>
+        <w:pStyle w:val="HTMLconformatoprevio"/>
+        <w:pBdr>
+          <w:left w:val="single" w:sz="24" w:space="12" w:color="F59E0B"/>
+        </w:pBdr>
+        <w:shd w:val="clear" w:color="auto" w:fill="0F172A"/>
+        <w:spacing w:before="120" w:after="210"/>
+        <w:rPr>
+          <w:rFonts w:ascii="Consolas" w:hAnsi="Consolas"/>
+          <w:color w:val="0F52BA"/>
+          <w:sz w:val="19"/>
+          <w:szCs w:val="19"/>
+          <w:shd w:val="clear" w:color="auto" w:fill="F1F5F9"/>
+          <w:lang w:val="es-ES"/>
+        </w:rPr>
+      </w:pPr>
+      <w:r>
+        <w:rPr>
+          <w:rFonts w:ascii="Consolas" w:hAnsi="Consolas"/>
+          <w:color w:val="0F52BA"/>
+          <w:sz w:val="19"/>
+          <w:szCs w:val="19"/>
+          <w:shd w:val="clear" w:color="auto" w:fill="F1F5F9"/>
+          <w:lang w:val="es-ES"/>
+        </w:rPr>
+        <w:t xml:space="preserve">    nombre,</w:t>
+      </w:r>
+    </w:p>
+    <w:p>
+      <w:pPr>
+        <w:pStyle w:val="HTMLconformatoprevio"/>
+        <w:pBdr>
+          <w:left w:val="single" w:sz="24" w:space="12" w:color="F59E0B"/>
+        </w:pBdr>
+        <w:shd w:val="clear" w:color="auto" w:fill="0F172A"/>
+        <w:spacing w:before="120" w:after="210"/>
+        <w:rPr>
+          <w:rFonts w:ascii="Consolas" w:hAnsi="Consolas"/>
+          <w:color w:val="0F52BA"/>
+          <w:sz w:val="19"/>
+          <w:szCs w:val="19"/>
+          <w:shd w:val="clear" w:color="auto" w:fill="F1F5F9"/>
+          <w:lang w:val="es-ES"/>
+        </w:rPr>
+      </w:pPr>
+      <w:r>
+        <w:rPr>
+          <w:rFonts w:ascii="Consolas" w:hAnsi="Consolas"/>
+          <w:color w:val="0F52BA"/>
+          <w:sz w:val="19"/>
+          <w:szCs w:val="19"/>
+          <w:shd w:val="clear" w:color="auto" w:fill="F1F5F9"/>
+          <w:lang w:val="es-ES"/>
+        </w:rPr>
+        <w:t xml:space="preserve">    apellido,</w:t>
+      </w:r>
+    </w:p>
+    <w:p>
+      <w:pPr>
+        <w:pStyle w:val="HTMLconformatoprevio"/>
+        <w:pBdr>
+          <w:left w:val="single" w:sz="24" w:space="12" w:color="F59E0B"/>
+        </w:pBdr>
+        <w:shd w:val="clear" w:color="auto" w:fill="0F172A"/>
+        <w:spacing w:before="120" w:after="210"/>
+        <w:rPr>
+          <w:rFonts w:ascii="Consolas" w:hAnsi="Consolas"/>
+          <w:color w:val="0F52BA"/>
+          <w:sz w:val="19"/>
+          <w:szCs w:val="19"/>
+          <w:shd w:val="clear" w:color="auto" w:fill="F1F5F9"/>
+          <w:lang w:val="es-ES"/>
+        </w:rPr>
+      </w:pPr>
+      <w:r>
+        <w:rPr>
+          <w:rFonts w:ascii="Consolas" w:hAnsi="Consolas"/>
+          <w:color w:val="0F52BA"/>
+          <w:sz w:val="19"/>
+          <w:szCs w:val="19"/>
+          <w:shd w:val="clear" w:color="auto" w:fill="F1F5F9"/>
+          <w:lang w:val="es-ES"/>
+        </w:rPr>
+        <w:t xml:space="preserve">    nombre || ' ' || apellido AS trabajador,</w:t>
+      </w:r>
+    </w:p>
+    <w:p>
+      <w:pPr>
+        <w:pStyle w:val="HTMLconformatoprevio"/>
+        <w:pBdr>
+          <w:left w:val="single" w:sz="24" w:space="12" w:color="F59E0B"/>
+        </w:pBdr>
+        <w:shd w:val="clear" w:color="auto" w:fill="0F172A"/>
+        <w:spacing w:before="120" w:after="210"/>
+        <w:rPr>
+          <w:rFonts w:ascii="Consolas" w:hAnsi="Consolas"/>
+          <w:color w:val="0F52BA"/>
+          <w:sz w:val="19"/>
+          <w:szCs w:val="19"/>
+          <w:shd w:val="clear" w:color="auto" w:fill="F1F5F9"/>
+          <w:lang w:val="es-ES"/>
+        </w:rPr>
+      </w:pPr>
+      <w:r>
+        <w:rPr>
+          <w:rFonts w:ascii="Consolas" w:hAnsi="Consolas"/>
+          <w:color w:val="0F52BA"/>
+          <w:sz w:val="19"/>
+          <w:szCs w:val="19"/>
+          <w:shd w:val="clear" w:color="auto" w:fill="F1F5F9"/>
+          <w:lang w:val="es-ES"/>
+        </w:rPr>
+        <w:t xml:space="preserve">    email,</w:t>
+      </w:r>
+    </w:p>
+    <w:p>
+      <w:pPr>
+        <w:pStyle w:val="HTMLconformatoprevio"/>
+        <w:pBdr>
+          <w:left w:val="single" w:sz="24" w:space="12" w:color="F59E0B"/>
+        </w:pBdr>
+        <w:shd w:val="clear" w:color="auto" w:fill="0F172A"/>
+        <w:spacing w:before="120" w:after="210"/>
+        <w:rPr>
+          <w:rFonts w:ascii="Consolas" w:hAnsi="Consolas"/>
+          <w:color w:val="0F52BA"/>
+          <w:sz w:val="19"/>
+          <w:szCs w:val="19"/>
+          <w:shd w:val="clear" w:color="auto" w:fill="F1F5F9"/>
+          <w:lang w:val="es-ES"/>
+        </w:rPr>
+      </w:pPr>
+      <w:r>
+        <w:rPr>
+          <w:rFonts w:ascii="Consolas" w:hAnsi="Consolas"/>
+          <w:color w:val="0F52BA"/>
+          <w:sz w:val="19"/>
+          <w:szCs w:val="19"/>
+          <w:shd w:val="clear" w:color="auto" w:fill="F1F5F9"/>
+          <w:lang w:val="es-ES"/>
+        </w:rPr>
+        <w:t xml:space="preserve">    telefono,</w:t>
+      </w:r>
+    </w:p>
+    <w:p>
+      <w:pPr>
+        <w:pStyle w:val="HTMLconformatoprevio"/>
+        <w:pBdr>
+          <w:left w:val="single" w:sz="24" w:space="12" w:color="F59E0B"/>
+        </w:pBdr>
+        <w:shd w:val="clear" w:color="auto" w:fill="0F172A"/>
+        <w:spacing w:before="120" w:after="210"/>
+        <w:rPr>
+          <w:rFonts w:ascii="Consolas" w:hAnsi="Consolas"/>
+          <w:color w:val="0F52BA"/>
+          <w:sz w:val="19"/>
+          <w:szCs w:val="19"/>
+          <w:shd w:val="clear" w:color="auto" w:fill="F1F5F9"/>
+          <w:lang w:val="es-ES"/>
+        </w:rPr>
+      </w:pPr>
+      <w:r>
+        <w:rPr>
+          <w:rFonts w:ascii="Consolas" w:hAnsi="Consolas"/>
+          <w:color w:val="0F52BA"/>
+          <w:sz w:val="19"/>
+          <w:szCs w:val="19"/>
+          <w:shd w:val="clear" w:color="auto" w:fill="F1F5F9"/>
+          <w:lang w:val="es-ES"/>
+        </w:rPr>
+        <w:t xml:space="preserve">    sueldo_base,</w:t>
+      </w:r>
+    </w:p>
+    <w:p>
+      <w:pPr>
+        <w:pStyle w:val="HTMLconformatoprevio"/>
+        <w:pBdr>
+          <w:left w:val="single" w:sz="24" w:space="12" w:color="F59E0B"/>
+        </w:pBdr>
+        <w:shd w:val="clear" w:color="auto" w:fill="0F172A"/>
+        <w:spacing w:before="120" w:after="210"/>
+        <w:rPr>
+          <w:rFonts w:ascii="Consolas" w:hAnsi="Consolas"/>
+          <w:color w:val="0F52BA"/>
+          <w:sz w:val="19"/>
+          <w:szCs w:val="19"/>
+          <w:shd w:val="clear" w:color="auto" w:fill="F1F5F9"/>
+          <w:lang w:val="es-ES"/>
+        </w:rPr>
+      </w:pPr>
+      <w:r>
+        <w:rPr>
+          <w:rFonts w:ascii="Consolas" w:hAnsi="Consolas"/>
+          <w:color w:val="0F52BA"/>
+          <w:sz w:val="19"/>
+          <w:szCs w:val="19"/>
+          <w:shd w:val="clear" w:color="auto" w:fill="F1F5F9"/>
+          <w:lang w:val="es-ES"/>
+        </w:rPr>
+        <w:t xml:space="preserve">    estado</w:t>
+      </w:r>
+    </w:p>
+    <w:p>
+      <w:pPr>
+        <w:pStyle w:val="HTMLconformatoprevio"/>
+        <w:pBdr>
+          <w:left w:val="single" w:sz="24" w:space="12" w:color="F59E0B"/>
+        </w:pBdr>
+        <w:shd w:val="clear" w:color="auto" w:fill="0F172A"/>
+        <w:spacing w:before="120" w:after="210"/>
+        <w:rPr>
+          <w:rFonts w:ascii="Consolas" w:hAnsi="Consolas"/>
+          <w:color w:val="0F52BA"/>
+          <w:sz w:val="19"/>
+          <w:szCs w:val="19"/>
+          <w:shd w:val="clear" w:color="auto" w:fill="F1F5F9"/>
+          <w:lang w:val="es-ES"/>
+        </w:rPr>
+      </w:pPr>
+      <w:r>
+        <w:rPr>
+          <w:rFonts w:ascii="Consolas" w:hAnsi="Consolas"/>
+          <w:color w:val="0F52BA"/>
+          <w:sz w:val="19"/>
+          <w:szCs w:val="19"/>
+          <w:shd w:val="clear" w:color="auto" w:fill="F1F5F9"/>
+          <w:lang w:val="es-ES"/>
+        </w:rPr>
+        <w:t>FROM USUARIO</w:t>
+      </w:r>
+    </w:p>
+    <w:p>
+      <w:pPr>
+        <w:pStyle w:val="HTMLconformatoprevio"/>
+        <w:pBdr>
+          <w:left w:val="single" w:sz="24" w:space="12" w:color="F59E0B"/>
+        </w:pBdr>
+        <w:shd w:val="clear" w:color="auto" w:fill="0F172A"/>
+        <w:spacing w:before="120" w:after="210"/>
+        <w:rPr>
+          <w:rFonts w:ascii="Consolas" w:hAnsi="Consolas"/>
+          <w:color w:val="0F52BA"/>
+          <w:sz w:val="19"/>
+          <w:szCs w:val="19"/>
+          <w:shd w:val="clear" w:color="auto" w:fill="F1F5F9"/>
+          <w:lang w:val="es-ES"/>
+        </w:rPr>
+      </w:pPr>
+      <w:r>
+        <w:rPr>
+          <w:rFonts w:ascii="Consolas" w:hAnsi="Consolas"/>
+          <w:color w:val="0F52BA"/>
+          <w:sz w:val="19"/>
+          <w:szCs w:val="19"/>
+          <w:shd w:val="clear" w:color="auto" w:fill="F1F5F9"/>
+          <w:lang w:val="es-ES"/>
+        </w:rPr>
+        <w:t>WHERE id_rol = 2;</w:t>
+      </w:r>
+    </w:p>
+    <w:p>
+      <w:pPr>
+        <w:pStyle w:val="HTMLconformatoprevio"/>
+        <w:pBdr>
+          <w:left w:val="single" w:sz="24" w:space="12" w:color="F59E0B"/>
+        </w:pBdr>
+        <w:shd w:val="clear" w:color="auto" w:fill="0F172A"/>
+        <w:spacing w:before="120" w:after="210"/>
+        <w:rPr>
+          <w:rFonts w:ascii="Consolas" w:hAnsi="Consolas"/>
+          <w:color w:val="0F52BA"/>
+          <w:sz w:val="19"/>
+          <w:szCs w:val="19"/>
+          <w:shd w:val="clear" w:color="auto" w:fill="F1F5F9"/>
+          <w:lang w:val="es-ES"/>
+        </w:rPr>
+      </w:pPr>
+    </w:p>
+    <w:p>
+      <w:pPr>
+        <w:pStyle w:val="HTMLconformatoprevio"/>
+        <w:pBdr>
+          <w:left w:val="single" w:sz="24" w:space="12" w:color="F59E0B"/>
+        </w:pBdr>
+        <w:shd w:val="clear" w:color="auto" w:fill="0F172A"/>
+        <w:spacing w:before="120" w:after="210"/>
+        <w:rPr>
+          <w:rFonts w:ascii="Consolas" w:hAnsi="Consolas"/>
+          <w:color w:val="0F52BA"/>
+          <w:sz w:val="19"/>
+          <w:szCs w:val="19"/>
+          <w:shd w:val="clear" w:color="auto" w:fill="F1F5F9"/>
+          <w:lang w:val="es-ES"/>
+        </w:rPr>
+      </w:pPr>
+      <w:r>
+        <w:rPr>
+          <w:rFonts w:ascii="Consolas" w:hAnsi="Consolas"/>
+          <w:color w:val="0F52BA"/>
+          <w:sz w:val="19"/>
+          <w:szCs w:val="19"/>
+          <w:shd w:val="clear" w:color="auto" w:fill="F1F5F9"/>
+          <w:lang w:val="es-ES"/>
+        </w:rPr>
+        <w:t>-- Vista exclusiva para Ventas y Tienda Web (Clientes)</w:t>
+      </w:r>
+    </w:p>
+    <w:p>
+      <w:pPr>
+        <w:pStyle w:val="HTMLconformatoprevio"/>
+        <w:pBdr>
+          <w:left w:val="single" w:sz="24" w:space="12" w:color="F59E0B"/>
+        </w:pBdr>
+        <w:shd w:val="clear" w:color="auto" w:fill="0F172A"/>
+        <w:spacing w:before="120" w:after="210"/>
+        <w:rPr>
+          <w:rFonts w:ascii="Consolas" w:hAnsi="Consolas"/>
+          <w:color w:val="0F52BA"/>
+          <w:sz w:val="19"/>
+          <w:szCs w:val="19"/>
+          <w:shd w:val="clear" w:color="auto" w:fill="F1F5F9"/>
+          <w:lang w:val="es-ES"/>
+        </w:rPr>
+      </w:pPr>
+      <w:r>
+        <w:rPr>
+          <w:rFonts w:ascii="Consolas" w:hAnsi="Consolas"/>
+          <w:color w:val="0F52BA"/>
+          <w:sz w:val="19"/>
+          <w:szCs w:val="19"/>
+          <w:shd w:val="clear" w:color="auto" w:fill="F1F5F9"/>
+          <w:lang w:val="es-ES"/>
+        </w:rPr>
+        <w:t>CREATE OR REPLACE VIEW V_CLIENTES AS</w:t>
+      </w:r>
+    </w:p>
+    <w:p>
+      <w:pPr>
+        <w:pStyle w:val="HTMLconformatoprevio"/>
+        <w:pBdr>
+          <w:left w:val="single" w:sz="24" w:space="12" w:color="F59E0B"/>
+        </w:pBdr>
+        <w:shd w:val="clear" w:color="auto" w:fill="0F172A"/>
+        <w:spacing w:before="120" w:after="210"/>
+        <w:rPr>
+          <w:rFonts w:ascii="Consolas" w:hAnsi="Consolas"/>
+          <w:color w:val="0F52BA"/>
+          <w:sz w:val="19"/>
+          <w:szCs w:val="19"/>
+          <w:shd w:val="clear" w:color="auto" w:fill="F1F5F9"/>
+          <w:lang w:val="es-ES"/>
+        </w:rPr>
+      </w:pPr>
+      <w:r>
+        <w:rPr>
+          <w:rFonts w:ascii="Consolas" w:hAnsi="Consolas"/>
+          <w:color w:val="0F52BA"/>
+          <w:sz w:val="19"/>
+          <w:szCs w:val="19"/>
+          <w:shd w:val="clear" w:color="auto" w:fill="F1F5F9"/>
+          <w:lang w:val="es-ES"/>
+        </w:rPr>
+        <w:t xml:space="preserve">SELECT </w:t>
+      </w:r>
+    </w:p>
+    <w:p>
+      <w:pPr>
+        <w:pStyle w:val="HTMLconformatoprevio"/>
+        <w:pBdr>
+          <w:left w:val="single" w:sz="24" w:space="12" w:color="F59E0B"/>
+        </w:pBdr>
+        <w:shd w:val="clear" w:color="auto" w:fill="0F172A"/>
+        <w:spacing w:before="120" w:after="210"/>
+        <w:rPr>
+          <w:rFonts w:ascii="Consolas" w:hAnsi="Consolas"/>
+          <w:color w:val="0F52BA"/>
+          <w:sz w:val="19"/>
+          <w:szCs w:val="19"/>
+          <w:shd w:val="clear" w:color="auto" w:fill="F1F5F9"/>
+          <w:lang w:val="es-ES"/>
+        </w:rPr>
+      </w:pPr>
+      <w:r>
+        <w:rPr>
+          <w:rFonts w:ascii="Consolas" w:hAnsi="Consolas"/>
+          <w:color w:val="0F52BA"/>
+          <w:sz w:val="19"/>
+          <w:szCs w:val="19"/>
+          <w:shd w:val="clear" w:color="auto" w:fill="F1F5F9"/>
+          <w:lang w:val="es-ES"/>
+        </w:rPr>
+        <w:t xml:space="preserve">    id_usuario AS id_cliente,</w:t>
+      </w:r>
+    </w:p>
+    <w:p>
+      <w:pPr>
+        <w:pStyle w:val="HTMLconformatoprevio"/>
+        <w:pBdr>
+          <w:left w:val="single" w:sz="24" w:space="12" w:color="F59E0B"/>
+        </w:pBdr>
+        <w:shd w:val="clear" w:color="auto" w:fill="0F172A"/>
+        <w:spacing w:before="120" w:after="210"/>
+        <w:rPr>
+          <w:rFonts w:ascii="Consolas" w:hAnsi="Consolas"/>
+          <w:color w:val="0F52BA"/>
+          <w:sz w:val="19"/>
+          <w:szCs w:val="19"/>
+          <w:shd w:val="clear" w:color="auto" w:fill="F1F5F9"/>
+          <w:lang w:val="es-ES"/>
+        </w:rPr>
+      </w:pPr>
+      <w:r>
+        <w:rPr>
+          <w:rFonts w:ascii="Consolas" w:hAnsi="Consolas"/>
+          <w:color w:val="0F52BA"/>
+          <w:sz w:val="19"/>
+          <w:szCs w:val="19"/>
+          <w:shd w:val="clear" w:color="auto" w:fill="F1F5F9"/>
+          <w:lang w:val="es-ES"/>
+        </w:rPr>
+        <w:t xml:space="preserve">    rut,</w:t>
+      </w:r>
+    </w:p>
+    <w:p>
+      <w:pPr>
+        <w:pStyle w:val="HTMLconformatoprevio"/>
+        <w:pBdr>
+          <w:left w:val="single" w:sz="24" w:space="12" w:color="F59E0B"/>
+        </w:pBdr>
+        <w:shd w:val="clear" w:color="auto" w:fill="0F172A"/>
+        <w:spacing w:before="120" w:after="210"/>
+        <w:rPr>
+          <w:rFonts w:ascii="Consolas" w:hAnsi="Consolas"/>
+          <w:color w:val="0F52BA"/>
+          <w:sz w:val="19"/>
+          <w:szCs w:val="19"/>
+          <w:shd w:val="clear" w:color="auto" w:fill="F1F5F9"/>
+          <w:lang w:val="es-ES"/>
+        </w:rPr>
+      </w:pPr>
+      <w:r>
+        <w:rPr>
+          <w:rFonts w:ascii="Consolas" w:hAnsi="Consolas"/>
+          <w:color w:val="0F52BA"/>
+          <w:sz w:val="19"/>
+          <w:szCs w:val="19"/>
+          <w:shd w:val="clear" w:color="auto" w:fill="F1F5F9"/>
+          <w:lang w:val="es-ES"/>
+        </w:rPr>
+        <w:t xml:space="preserve">    nombre,</w:t>
+      </w:r>
+    </w:p>
+    <w:p>
+      <w:pPr>
+        <w:pStyle w:val="HTMLconformatoprevio"/>
+        <w:pBdr>
+          <w:left w:val="single" w:sz="24" w:space="12" w:color="F59E0B"/>
+        </w:pBdr>
+        <w:shd w:val="clear" w:color="auto" w:fill="0F172A"/>
+        <w:spacing w:before="120" w:after="210"/>
+        <w:rPr>
+          <w:rFonts w:ascii="Consolas" w:hAnsi="Consolas"/>
+          <w:color w:val="0F52BA"/>
+          <w:sz w:val="19"/>
+          <w:szCs w:val="19"/>
+          <w:shd w:val="clear" w:color="auto" w:fill="F1F5F9"/>
+          <w:lang w:val="es-ES"/>
+        </w:rPr>
+      </w:pPr>
+      <w:r>
+        <w:rPr>
+          <w:rFonts w:ascii="Consolas" w:hAnsi="Consolas"/>
+          <w:color w:val="0F52BA"/>
+          <w:sz w:val="19"/>
+          <w:szCs w:val="19"/>
+          <w:shd w:val="clear" w:color="auto" w:fill="F1F5F9"/>
+          <w:lang w:val="es-ES"/>
+        </w:rPr>
+        <w:t xml:space="preserve">    apellido,</w:t>
+      </w:r>
+    </w:p>
+    <w:p>
+      <w:pPr>
+        <w:pStyle w:val="HTMLconformatoprevio"/>
+        <w:pBdr>
+          <w:left w:val="single" w:sz="24" w:space="12" w:color="F59E0B"/>
+        </w:pBdr>
+        <w:shd w:val="clear" w:color="auto" w:fill="0F172A"/>
+        <w:spacing w:before="120" w:after="210"/>
+        <w:rPr>
+          <w:rFonts w:ascii="Consolas" w:hAnsi="Consolas"/>
+          <w:color w:val="0F52BA"/>
+          <w:sz w:val="19"/>
+          <w:szCs w:val="19"/>
+          <w:shd w:val="clear" w:color="auto" w:fill="F1F5F9"/>
+          <w:lang w:val="es-ES"/>
+        </w:rPr>
+      </w:pPr>
+      <w:r>
+        <w:rPr>
+          <w:rFonts w:ascii="Consolas" w:hAnsi="Consolas"/>
+          <w:color w:val="0F52BA"/>
+          <w:sz w:val="19"/>
+          <w:szCs w:val="19"/>
+          <w:shd w:val="clear" w:color="auto" w:fill="F1F5F9"/>
+          <w:lang w:val="es-ES"/>
+        </w:rPr>
+        <w:t xml:space="preserve">    nombre || ' ' || apellido AS cliente,</w:t>
+      </w:r>
+    </w:p>
+    <w:p>
+      <w:pPr>
+        <w:pStyle w:val="HTMLconformatoprevio"/>
+        <w:pBdr>
+          <w:left w:val="single" w:sz="24" w:space="12" w:color="F59E0B"/>
+        </w:pBdr>
+        <w:shd w:val="clear" w:color="auto" w:fill="0F172A"/>
+        <w:spacing w:before="120" w:after="210"/>
+        <w:rPr>
+          <w:rFonts w:ascii="Consolas" w:hAnsi="Consolas"/>
+          <w:color w:val="0F52BA"/>
+          <w:sz w:val="19"/>
+          <w:szCs w:val="19"/>
+          <w:shd w:val="clear" w:color="auto" w:fill="F1F5F9"/>
+          <w:lang w:val="es-ES"/>
+        </w:rPr>
+      </w:pPr>
+      <w:r>
+        <w:rPr>
+          <w:rFonts w:ascii="Consolas" w:hAnsi="Consolas"/>
+          <w:color w:val="0F52BA"/>
+          <w:sz w:val="19"/>
+          <w:szCs w:val="19"/>
+          <w:shd w:val="clear" w:color="auto" w:fill="F1F5F9"/>
+          <w:lang w:val="es-ES"/>
+        </w:rPr>
+        <w:t xml:space="preserve">    email,</w:t>
+      </w:r>
+    </w:p>
+    <w:p>
+      <w:pPr>
+        <w:pStyle w:val="HTMLconformatoprevio"/>
+        <w:pBdr>
+          <w:left w:val="single" w:sz="24" w:space="12" w:color="F59E0B"/>
+        </w:pBdr>
+        <w:shd w:val="clear" w:color="auto" w:fill="0F172A"/>
+        <w:spacing w:before="120" w:after="210"/>
+        <w:rPr>
+          <w:rFonts w:ascii="Consolas" w:hAnsi="Consolas"/>
+          <w:color w:val="0F52BA"/>
+          <w:sz w:val="19"/>
+          <w:szCs w:val="19"/>
+          <w:shd w:val="clear" w:color="auto" w:fill="F1F5F9"/>
+          <w:lang w:val="es-ES"/>
+        </w:rPr>
+      </w:pPr>
+      <w:r>
+        <w:rPr>
+          <w:rFonts w:ascii="Consolas" w:hAnsi="Consolas"/>
+          <w:color w:val="0F52BA"/>
+          <w:sz w:val="19"/>
+          <w:szCs w:val="19"/>
+          <w:shd w:val="clear" w:color="auto" w:fill="F1F5F9"/>
+          <w:lang w:val="es-ES"/>
+        </w:rPr>
+        <w:t xml:space="preserve">    telefono,</w:t>
+      </w:r>
+    </w:p>
+    <w:p>
+      <w:pPr>
+        <w:pStyle w:val="HTMLconformatoprevio"/>
+        <w:pBdr>
+          <w:left w:val="single" w:sz="24" w:space="12" w:color="F59E0B"/>
+        </w:pBdr>
+        <w:shd w:val="clear" w:color="auto" w:fill="0F172A"/>
+        <w:spacing w:before="120" w:after="210"/>
+        <w:rPr>
+          <w:rFonts w:ascii="Consolas" w:hAnsi="Consolas"/>
+          <w:color w:val="0F52BA"/>
+          <w:sz w:val="19"/>
+          <w:szCs w:val="19"/>
+          <w:shd w:val="clear" w:color="auto" w:fill="F1F5F9"/>
+          <w:lang w:val="es-ES"/>
+        </w:rPr>
+      </w:pPr>
+      <w:r>
+        <w:rPr>
+          <w:rFonts w:ascii="Consolas" w:hAnsi="Consolas"/>
+          <w:color w:val="0F52BA"/>
+          <w:sz w:val="19"/>
+          <w:szCs w:val="19"/>
+          <w:shd w:val="clear" w:color="auto" w:fill="F1F5F9"/>
+          <w:lang w:val="es-ES"/>
+        </w:rPr>
+        <w:t xml:space="preserve">    estado</w:t>
+      </w:r>
+    </w:p>
+    <w:p>
+      <w:pPr>
+        <w:pStyle w:val="HTMLconformatoprevio"/>
+        <w:pBdr>
+          <w:left w:val="single" w:sz="24" w:space="12" w:color="F59E0B"/>
+        </w:pBdr>
+        <w:shd w:val="clear" w:color="auto" w:fill="0F172A"/>
+        <w:spacing w:before="120" w:after="210"/>
+        <w:rPr>
+          <w:rFonts w:ascii="Consolas" w:hAnsi="Consolas"/>
+          <w:color w:val="0F52BA"/>
+          <w:sz w:val="19"/>
+          <w:szCs w:val="19"/>
+          <w:shd w:val="clear" w:color="auto" w:fill="F1F5F9"/>
+          <w:lang w:val="es-ES"/>
+        </w:rPr>
+      </w:pPr>
+      <w:r>
+        <w:rPr>
+          <w:rFonts w:ascii="Consolas" w:hAnsi="Consolas"/>
+          <w:color w:val="0F52BA"/>
+          <w:sz w:val="19"/>
+          <w:szCs w:val="19"/>
+          <w:shd w:val="clear" w:color="auto" w:fill="F1F5F9"/>
+          <w:lang w:val="es-ES"/>
+        </w:rPr>
+        <w:t>FROM USUARIO</w:t>
+      </w:r>
+    </w:p>
+    <w:p>
+      <w:pPr>
+        <w:pStyle w:val="HTMLconformatoprevio"/>
+        <w:pBdr>
+          <w:left w:val="single" w:sz="24" w:space="12" w:color="F59E0B"/>
+        </w:pBdr>
+        <w:shd w:val="clear" w:color="auto" w:fill="0F172A"/>
+        <w:spacing w:before="120" w:after="210"/>
+        <w:rPr>
+          <w:rFonts w:ascii="Consolas" w:hAnsi="Consolas"/>
+          <w:color w:val="E2E8F0"/>
+          <w:sz w:val="18"/>
+          <w:szCs w:val="18"/>
+          <w:lang w:val="es-ES"/>
+        </w:rPr>
+      </w:pPr>
+      <w:r>
+        <w:rPr>
+          <w:rFonts w:ascii="Consolas" w:hAnsi="Consolas"/>
+          <w:color w:val="0F52BA"/>
+          <w:sz w:val="19"/>
+          <w:szCs w:val="19"/>
+          <w:shd w:val="clear" w:color="auto" w:fill="F1F5F9"/>
+          <w:lang w:val="es-ES"/>
+        </w:rPr>
+        <w:t>WHERE id_rol = 3;</w:t>
       </w:r>
     </w:p>
     <w:p>
@@ -5985,17 +6916,7 @@
           <w:szCs w:val="22"/>
           <w:lang w:val="es-ES"/>
         </w:rPr>
-        <w:t xml:space="preserve"> </w:t>
-      </w:r>
-      <w:r>
-        <w:rPr>
-          <w:rFonts w:ascii="Calibri" w:eastAsia="Times New Roman" w:hAnsi="Calibri" w:cs="Calibri"/>
-          <w:color w:val="1F2937"/>
-          <w:sz w:val="22"/>
-          <w:szCs w:val="22"/>
-          <w:lang w:val="es-ES"/>
-        </w:rPr>
-        <w:t xml:space="preserve">Se disparan tantas veces como filas sean afectadas por la sentencia. Proveen acceso a los pseudorregistros </w:t>
+        <w:t xml:space="preserve"> Se disparan tantas veces como filas sean afectadas por la sentencia. Proveen acceso a los pseudorregistros </w:t>
       </w:r>
       <w:r>
         <w:rPr>
@@ -6160,7 +7081,17 @@
           <w:szCs w:val="22"/>
           <w:lang w:val="es-ES"/>
         </w:rPr>
-        <w:t xml:space="preserve"> Se disparan una única vez por cada sentencia DML global. Es el mecanismo fundamental para comprobaciones agregadas (</w:t>
+        <w:t xml:space="preserve"> </w:t>
+      </w:r>
+      <w:r>
+        <w:rPr>
+          <w:rFonts w:ascii="Calibri" w:eastAsia="Times New Roman" w:hAnsi="Calibri" w:cs="Calibri"/>
+          <w:color w:val="1F2937"/>
+          <w:sz w:val="22"/>
+          <w:szCs w:val="22"/>
+          <w:lang w:val="es-ES"/>
+        </w:rPr>
+        <w:t>Se disparan una única vez por cada sentencia DML global. Es el mecanismo fundamental para comprobaciones agregadas (</w:t>
       </w:r>
       <w:r>
         <w:rPr>
@@ -6376,7 +7307,17 @@
           <w:szCs w:val="22"/>
           <w:lang w:val="es-ES"/>
         </w:rPr>
-        <w:t xml:space="preserve"> Impide registrar sueldos inferiores a $500.000 para operadores o administradores, cancelando la transacción preventivamente mediante </w:t>
+        <w:t xml:space="preserve"> </w:t>
+      </w:r>
+      <w:r>
+        <w:rPr>
+          <w:rFonts w:ascii="Calibri" w:hAnsi="Calibri" w:cs="Calibri"/>
+          <w:color w:val="1F2937"/>
+          <w:sz w:val="22"/>
+          <w:szCs w:val="22"/>
+          <w:lang w:val="es-ES"/>
+        </w:rPr>
+        <w:t xml:space="preserve">Impide registrar sueldos inferiores a $500.000 para operadores o administradores, cancelando la transacción preventivamente mediante </w:t>
       </w:r>
       <w:r>
         <w:rPr>
@@ -6857,7 +7798,14 @@
           <w:szCs w:val="22"/>
           <w:lang w:val="es-ES"/>
         </w:rPr>
-        <w:t xml:space="preserve"> </w:t>
+        <w:t xml:space="preserve"> Ante cualquier cambio de sueldo, captura el sueldo previo (</w:t>
+      </w:r>
+      <w:r>
+        <w:rPr>
+          <w:rStyle w:val="CdigoHTML"/>
+          <w:lang w:val="es-ES"/>
+        </w:rPr>
+        <w:t>:OLD.sueldo_base</w:t>
       </w:r>
       <w:r>
         <w:rPr>
@@ -6867,14 +7815,14 @@
           <w:szCs w:val="22"/>
           <w:lang w:val="es-ES"/>
         </w:rPr>
-        <w:t>Ante cualquier cambio de sueldo, captura el sueldo previo (</w:t>
+        <w:t>), el nuevo (</w:t>
       </w:r>
       <w:r>
         <w:rPr>
           <w:rStyle w:val="CdigoHTML"/>
           <w:lang w:val="es-ES"/>
         </w:rPr>
-        <w:t>:OLD.sueldo_base</w:t>
+        <w:t>:NEW.sueldo_base</w:t>
       </w:r>
       <w:r>
         <w:rPr>
@@ -6884,14 +7832,14 @@
           <w:szCs w:val="22"/>
           <w:lang w:val="es-ES"/>
         </w:rPr>
-        <w:t>), el nuevo (</w:t>
+        <w:t>), el usuario conectado (</w:t>
       </w:r>
       <w:r>
         <w:rPr>
           <w:rStyle w:val="CdigoHTML"/>
           <w:lang w:val="es-ES"/>
         </w:rPr>
-        <w:t>:NEW.sueldo_base</w:t>
+        <w:t>USER</w:t>
       </w:r>
       <w:r>
         <w:rPr>
@@ -6901,14 +7849,14 @@
           <w:szCs w:val="22"/>
           <w:lang w:val="es-ES"/>
         </w:rPr>
-        <w:t>), el usuario conectado (</w:t>
+        <w:t>), la fecha exacta (</w:t>
       </w:r>
       <w:r>
         <w:rPr>
           <w:rStyle w:val="CdigoHTML"/>
           <w:lang w:val="es-ES"/>
         </w:rPr>
-        <w:t>USER</w:t>
+        <w:t>SYSDATE</w:t>
       </w:r>
       <w:r>
         <w:rPr>
@@ -6918,14 +7866,14 @@
           <w:szCs w:val="22"/>
           <w:lang w:val="es-ES"/>
         </w:rPr>
-        <w:t>), la fecha exacta (</w:t>
+        <w:t xml:space="preserve">) y el tipo de movimiento, insertando el registro en </w:t>
       </w:r>
       <w:r>
         <w:rPr>
           <w:rStyle w:val="CdigoHTML"/>
           <w:lang w:val="es-ES"/>
         </w:rPr>
-        <w:t>SYSDATE</w:t>
+        <w:t>AUDITORIA_SUELDO_EMPLEADO</w:t>
       </w:r>
       <w:r>
         <w:rPr>
@@ -6935,23 +7883,6 @@
           <w:szCs w:val="22"/>
           <w:lang w:val="es-ES"/>
         </w:rPr>
-        <w:t xml:space="preserve">) y el tipo de movimiento, insertando el registro en </w:t>
-      </w:r>
-      <w:r>
-        <w:rPr>
-          <w:rStyle w:val="CdigoHTML"/>
-          <w:lang w:val="es-ES"/>
-        </w:rPr>
-        <w:t>AUDITORIA_SUELDO_EMPLEADO</w:t>
-      </w:r>
-      <w:r>
-        <w:rPr>
-          <w:rFonts w:ascii="Calibri" w:hAnsi="Calibri" w:cs="Calibri"/>
-          <w:color w:val="1F2937"/>
-          <w:sz w:val="22"/>
-          <w:szCs w:val="22"/>
-          <w:lang w:val="es-ES"/>
-        </w:rPr>
         <w:t xml:space="preserve">. </w:t>
       </w:r>
     </w:p>
@@ -7271,18 +8202,7 @@
           <w:shd w:val="clear" w:color="auto" w:fill="F1F5F9"/>
           <w:lang w:val="es-ES"/>
         </w:rPr>
-        <w:t xml:space="preserve">    </w:t>
-      </w:r>
-      <w:r>
-        <w:rPr>
-          <w:rFonts w:ascii="Consolas" w:hAnsi="Consolas"/>
-          <w:color w:val="0F52BA"/>
-          <w:sz w:val="19"/>
-          <w:szCs w:val="19"/>
-          <w:shd w:val="clear" w:color="auto" w:fill="F1F5F9"/>
-          <w:lang w:val="es-ES"/>
-        </w:rPr>
-        <w:t>END IF;</w:t>
+        <w:t xml:space="preserve">    END IF;</w:t>
       </w:r>
     </w:p>
     <w:p>
@@ -7474,7 +8394,18 @@
           <w:shd w:val="clear" w:color="auto" w:fill="F1F5F9"/>
           <w:lang w:val="es-ES"/>
         </w:rPr>
-        <w:t xml:space="preserve">        (:NEW.sueldo_base - :OLD.sueldo_base), v_tipo, USER, SYSDATE</w:t>
+        <w:t xml:space="preserve">        </w:t>
+      </w:r>
+      <w:r>
+        <w:rPr>
+          <w:rFonts w:ascii="Consolas" w:hAnsi="Consolas"/>
+          <w:color w:val="0F52BA"/>
+          <w:sz w:val="19"/>
+          <w:szCs w:val="19"/>
+          <w:shd w:val="clear" w:color="auto" w:fill="F1F5F9"/>
+          <w:lang w:val="es-ES"/>
+        </w:rPr>
+        <w:t>(:NEW.sueldo_base - :OLD.sueldo_base), v_tipo, USER, SYSDATE</w:t>
       </w:r>
     </w:p>
     <w:p>
@@ -7656,247 +8587,248 @@
           <w:szCs w:val="22"/>
           <w:lang w:val="es-ES"/>
         </w:rPr>
+        <w:t xml:space="preserve"> Cada vez que un pedido cambia de estado logístico (de </w:t>
+      </w:r>
+      <w:r>
+        <w:rPr>
+          <w:rStyle w:val="CdigoHTML"/>
+          <w:lang w:val="es-ES"/>
+        </w:rPr>
+        <w:t>PAGADO</w:t>
+      </w:r>
+      <w:r>
+        <w:rPr>
+          <w:rFonts w:ascii="Calibri" w:hAnsi="Calibri" w:cs="Calibri"/>
+          <w:color w:val="1F2937"/>
+          <w:sz w:val="22"/>
+          <w:szCs w:val="22"/>
+          <w:lang w:val="es-ES"/>
+        </w:rPr>
+        <w:t xml:space="preserve"> a </w:t>
+      </w:r>
+      <w:r>
+        <w:rPr>
+          <w:rStyle w:val="CdigoHTML"/>
+          <w:lang w:val="es-ES"/>
+        </w:rPr>
+        <w:t>EN_EMPAQUETAMIENTO</w:t>
+      </w:r>
+      <w:r>
+        <w:rPr>
+          <w:rFonts w:ascii="Calibri" w:hAnsi="Calibri" w:cs="Calibri"/>
+          <w:color w:val="1F2937"/>
+          <w:sz w:val="22"/>
+          <w:szCs w:val="22"/>
+          <w:lang w:val="es-ES"/>
+        </w:rPr>
+        <w:t xml:space="preserve">, </w:t>
+      </w:r>
+      <w:r>
+        <w:rPr>
+          <w:rStyle w:val="CdigoHTML"/>
+          <w:lang w:val="es-ES"/>
+        </w:rPr>
+        <w:t>EN_CAMINO</w:t>
+      </w:r>
+      <w:r>
+        <w:rPr>
+          <w:rFonts w:ascii="Calibri" w:hAnsi="Calibri" w:cs="Calibri"/>
+          <w:color w:val="1F2937"/>
+          <w:sz w:val="22"/>
+          <w:szCs w:val="22"/>
+          <w:lang w:val="es-ES"/>
+        </w:rPr>
+        <w:t xml:space="preserve"> o </w:t>
+      </w:r>
+      <w:r>
+        <w:rPr>
+          <w:rStyle w:val="CdigoHTML"/>
+          <w:lang w:val="es-ES"/>
+        </w:rPr>
+        <w:t>ENTREGADO</w:t>
+      </w:r>
+      <w:r>
+        <w:rPr>
+          <w:rFonts w:ascii="Calibri" w:hAnsi="Calibri" w:cs="Calibri"/>
+          <w:color w:val="1F2937"/>
+          <w:sz w:val="22"/>
+          <w:szCs w:val="22"/>
+          <w:lang w:val="es-ES"/>
+        </w:rPr>
+        <w:t xml:space="preserve">), el disparador inserta automáticamente el evento en </w:t>
+      </w:r>
+      <w:r>
+        <w:rPr>
+          <w:rStyle w:val="CdigoHTML"/>
+          <w:lang w:val="es-ES"/>
+        </w:rPr>
+        <w:t>HISTORIAL_TRACKING_PEDIDO</w:t>
+      </w:r>
+      <w:r>
+        <w:rPr>
+          <w:rFonts w:ascii="Calibri" w:hAnsi="Calibri" w:cs="Calibri"/>
+          <w:color w:val="1F2937"/>
+          <w:sz w:val="22"/>
+          <w:szCs w:val="22"/>
+          <w:lang w:val="es-ES"/>
+        </w:rPr>
+        <w:t xml:space="preserve">. </w:t>
+      </w:r>
+    </w:p>
+    <w:p>
+      <w:pPr>
+        <w:pStyle w:val="HTMLconformatoprevio"/>
+        <w:pBdr>
+          <w:left w:val="single" w:sz="24" w:space="12" w:color="F59E0B"/>
+        </w:pBdr>
+        <w:shd w:val="clear" w:color="auto" w:fill="0F172A"/>
+        <w:spacing w:before="120" w:after="210"/>
+        <w:rPr>
+          <w:rFonts w:ascii="Consolas" w:hAnsi="Consolas"/>
+          <w:color w:val="0F52BA"/>
+          <w:sz w:val="19"/>
+          <w:szCs w:val="19"/>
+          <w:shd w:val="clear" w:color="auto" w:fill="F1F5F9"/>
+          <w:lang w:val="es-ES"/>
+        </w:rPr>
+      </w:pPr>
+      <w:r>
+        <w:rPr>
+          <w:rFonts w:ascii="Consolas" w:hAnsi="Consolas"/>
+          <w:color w:val="0F52BA"/>
+          <w:sz w:val="19"/>
+          <w:szCs w:val="19"/>
+          <w:shd w:val="clear" w:color="auto" w:fill="F1F5F9"/>
+          <w:lang w:val="es-ES"/>
+        </w:rPr>
+        <w:t>CREATE OR REPLACE TRIGGER trg_tracking_cambio_estado_pedido</w:t>
+      </w:r>
+    </w:p>
+    <w:p>
+      <w:pPr>
+        <w:pStyle w:val="HTMLconformatoprevio"/>
+        <w:pBdr>
+          <w:left w:val="single" w:sz="24" w:space="12" w:color="F59E0B"/>
+        </w:pBdr>
+        <w:shd w:val="clear" w:color="auto" w:fill="0F172A"/>
+        <w:spacing w:before="120" w:after="210"/>
+        <w:rPr>
+          <w:rFonts w:ascii="Consolas" w:hAnsi="Consolas"/>
+          <w:color w:val="0F52BA"/>
+          <w:sz w:val="19"/>
+          <w:szCs w:val="19"/>
+          <w:shd w:val="clear" w:color="auto" w:fill="F1F5F9"/>
+          <w:lang w:val="es-ES"/>
+        </w:rPr>
+      </w:pPr>
+      <w:r>
+        <w:rPr>
+          <w:rFonts w:ascii="Consolas" w:hAnsi="Consolas"/>
+          <w:color w:val="0F52BA"/>
+          <w:sz w:val="19"/>
+          <w:szCs w:val="19"/>
+          <w:shd w:val="clear" w:color="auto" w:fill="F1F5F9"/>
+          <w:lang w:val="es-ES"/>
+        </w:rPr>
+        <w:t>AFTER UPDATE OF id_estado ON PEDIDO</w:t>
+      </w:r>
+    </w:p>
+    <w:p>
+      <w:pPr>
+        <w:pStyle w:val="HTMLconformatoprevio"/>
+        <w:pBdr>
+          <w:left w:val="single" w:sz="24" w:space="12" w:color="F59E0B"/>
+        </w:pBdr>
+        <w:shd w:val="clear" w:color="auto" w:fill="0F172A"/>
+        <w:spacing w:before="120" w:after="210"/>
+        <w:rPr>
+          <w:rFonts w:ascii="Consolas" w:hAnsi="Consolas"/>
+          <w:color w:val="0F52BA"/>
+          <w:sz w:val="19"/>
+          <w:szCs w:val="19"/>
+          <w:shd w:val="clear" w:color="auto" w:fill="F1F5F9"/>
+          <w:lang w:val="es-ES"/>
+        </w:rPr>
+      </w:pPr>
+      <w:r>
+        <w:rPr>
+          <w:rFonts w:ascii="Consolas" w:hAnsi="Consolas"/>
+          <w:color w:val="0F52BA"/>
+          <w:sz w:val="19"/>
+          <w:szCs w:val="19"/>
+          <w:shd w:val="clear" w:color="auto" w:fill="F1F5F9"/>
+          <w:lang w:val="es-ES"/>
+        </w:rPr>
+        <w:t>FOR EACH ROW</w:t>
+      </w:r>
+    </w:p>
+    <w:p>
+      <w:pPr>
+        <w:pStyle w:val="HTMLconformatoprevio"/>
+        <w:pBdr>
+          <w:left w:val="single" w:sz="24" w:space="12" w:color="F59E0B"/>
+        </w:pBdr>
+        <w:shd w:val="clear" w:color="auto" w:fill="0F172A"/>
+        <w:spacing w:before="120" w:after="210"/>
+        <w:rPr>
+          <w:rFonts w:ascii="Consolas" w:hAnsi="Consolas"/>
+          <w:color w:val="0F52BA"/>
+          <w:sz w:val="19"/>
+          <w:szCs w:val="19"/>
+          <w:shd w:val="clear" w:color="auto" w:fill="F1F5F9"/>
+          <w:lang w:val="es-ES"/>
+        </w:rPr>
+      </w:pPr>
+      <w:r>
+        <w:rPr>
+          <w:rFonts w:ascii="Consolas" w:hAnsi="Consolas"/>
+          <w:color w:val="0F52BA"/>
+          <w:sz w:val="19"/>
+          <w:szCs w:val="19"/>
+          <w:shd w:val="clear" w:color="auto" w:fill="F1F5F9"/>
+          <w:lang w:val="es-ES"/>
+        </w:rPr>
+        <w:t>BEGIN</w:t>
+      </w:r>
+    </w:p>
+    <w:p>
+      <w:pPr>
+        <w:pStyle w:val="HTMLconformatoprevio"/>
+        <w:pBdr>
+          <w:left w:val="single" w:sz="24" w:space="12" w:color="F59E0B"/>
+        </w:pBdr>
+        <w:shd w:val="clear" w:color="auto" w:fill="0F172A"/>
+        <w:spacing w:before="120" w:after="210"/>
+        <w:rPr>
+          <w:rFonts w:ascii="Consolas" w:hAnsi="Consolas"/>
+          <w:color w:val="0F52BA"/>
+          <w:sz w:val="19"/>
+          <w:szCs w:val="19"/>
+          <w:shd w:val="clear" w:color="auto" w:fill="F1F5F9"/>
+          <w:lang w:val="es-ES"/>
+        </w:rPr>
+      </w:pPr>
+      <w:r>
+        <w:rPr>
+          <w:rFonts w:ascii="Consolas" w:hAnsi="Consolas"/>
+          <w:color w:val="0F52BA"/>
+          <w:sz w:val="19"/>
+          <w:szCs w:val="19"/>
+          <w:shd w:val="clear" w:color="auto" w:fill="F1F5F9"/>
+          <w:lang w:val="es-ES"/>
+        </w:rPr>
         <w:t xml:space="preserve"> </w:t>
       </w:r>
       <w:r>
         <w:rPr>
-          <w:rFonts w:ascii="Calibri" w:hAnsi="Calibri" w:cs="Calibri"/>
-          <w:color w:val="1F2937"/>
-          <w:sz w:val="22"/>
-          <w:szCs w:val="22"/>
-          <w:lang w:val="es-ES"/>
-        </w:rPr>
-        <w:t xml:space="preserve">Cada vez que un pedido cambia de estado logístico (de </w:t>
-      </w:r>
-      <w:r>
-        <w:rPr>
-          <w:rStyle w:val="CdigoHTML"/>
-          <w:lang w:val="es-ES"/>
-        </w:rPr>
-        <w:t>PAGADO</w:t>
-      </w:r>
-      <w:r>
-        <w:rPr>
-          <w:rFonts w:ascii="Calibri" w:hAnsi="Calibri" w:cs="Calibri"/>
-          <w:color w:val="1F2937"/>
-          <w:sz w:val="22"/>
-          <w:szCs w:val="22"/>
-          <w:lang w:val="es-ES"/>
-        </w:rPr>
-        <w:t xml:space="preserve"> a </w:t>
-      </w:r>
-      <w:r>
-        <w:rPr>
-          <w:rStyle w:val="CdigoHTML"/>
-          <w:lang w:val="es-ES"/>
-        </w:rPr>
-        <w:t>EN_EMPAQUETAMIENTO</w:t>
-      </w:r>
-      <w:r>
-        <w:rPr>
-          <w:rFonts w:ascii="Calibri" w:hAnsi="Calibri" w:cs="Calibri"/>
-          <w:color w:val="1F2937"/>
-          <w:sz w:val="22"/>
-          <w:szCs w:val="22"/>
-          <w:lang w:val="es-ES"/>
-        </w:rPr>
-        <w:t xml:space="preserve">, </w:t>
-      </w:r>
-      <w:r>
-        <w:rPr>
-          <w:rStyle w:val="CdigoHTML"/>
-          <w:lang w:val="es-ES"/>
-        </w:rPr>
-        <w:t>EN_CAMINO</w:t>
-      </w:r>
-      <w:r>
-        <w:rPr>
-          <w:rFonts w:ascii="Calibri" w:hAnsi="Calibri" w:cs="Calibri"/>
-          <w:color w:val="1F2937"/>
-          <w:sz w:val="22"/>
-          <w:szCs w:val="22"/>
-          <w:lang w:val="es-ES"/>
-        </w:rPr>
-        <w:t xml:space="preserve"> o </w:t>
-      </w:r>
-      <w:r>
-        <w:rPr>
-          <w:rStyle w:val="CdigoHTML"/>
-          <w:lang w:val="es-ES"/>
-        </w:rPr>
-        <w:t>ENTREGADO</w:t>
-      </w:r>
-      <w:r>
-        <w:rPr>
-          <w:rFonts w:ascii="Calibri" w:hAnsi="Calibri" w:cs="Calibri"/>
-          <w:color w:val="1F2937"/>
-          <w:sz w:val="22"/>
-          <w:szCs w:val="22"/>
-          <w:lang w:val="es-ES"/>
-        </w:rPr>
-        <w:t xml:space="preserve">), el disparador inserta automáticamente el evento en </w:t>
-      </w:r>
-      <w:r>
-        <w:rPr>
-          <w:rStyle w:val="CdigoHTML"/>
-          <w:lang w:val="es-ES"/>
-        </w:rPr>
-        <w:t>HISTORIAL_TRACKING_PEDIDO</w:t>
-      </w:r>
-      <w:r>
-        <w:rPr>
-          <w:rFonts w:ascii="Calibri" w:hAnsi="Calibri" w:cs="Calibri"/>
-          <w:color w:val="1F2937"/>
-          <w:sz w:val="22"/>
-          <w:szCs w:val="22"/>
-          <w:lang w:val="es-ES"/>
-        </w:rPr>
-        <w:t xml:space="preserve">. </w:t>
-      </w:r>
-    </w:p>
-    <w:p>
-      <w:pPr>
-        <w:pStyle w:val="HTMLconformatoprevio"/>
-        <w:pBdr>
-          <w:left w:val="single" w:sz="24" w:space="12" w:color="F59E0B"/>
-        </w:pBdr>
-        <w:shd w:val="clear" w:color="auto" w:fill="0F172A"/>
-        <w:spacing w:before="120" w:after="210"/>
-        <w:rPr>
-          <w:rFonts w:ascii="Consolas" w:hAnsi="Consolas"/>
-          <w:color w:val="0F52BA"/>
-          <w:sz w:val="19"/>
-          <w:szCs w:val="19"/>
-          <w:shd w:val="clear" w:color="auto" w:fill="F1F5F9"/>
-          <w:lang w:val="es-ES"/>
-        </w:rPr>
-      </w:pPr>
-      <w:r>
-        <w:rPr>
-          <w:rFonts w:ascii="Consolas" w:hAnsi="Consolas"/>
-          <w:color w:val="0F52BA"/>
-          <w:sz w:val="19"/>
-          <w:szCs w:val="19"/>
-          <w:shd w:val="clear" w:color="auto" w:fill="F1F5F9"/>
-          <w:lang w:val="es-ES"/>
-        </w:rPr>
-        <w:t>CREATE OR REPLACE TRIGGER trg_tracking_cambio_estado_pedido</w:t>
-      </w:r>
-    </w:p>
-    <w:p>
-      <w:pPr>
-        <w:pStyle w:val="HTMLconformatoprevio"/>
-        <w:pBdr>
-          <w:left w:val="single" w:sz="24" w:space="12" w:color="F59E0B"/>
-        </w:pBdr>
-        <w:shd w:val="clear" w:color="auto" w:fill="0F172A"/>
-        <w:spacing w:before="120" w:after="210"/>
-        <w:rPr>
-          <w:rFonts w:ascii="Consolas" w:hAnsi="Consolas"/>
-          <w:color w:val="0F52BA"/>
-          <w:sz w:val="19"/>
-          <w:szCs w:val="19"/>
-          <w:shd w:val="clear" w:color="auto" w:fill="F1F5F9"/>
-          <w:lang w:val="es-ES"/>
-        </w:rPr>
-      </w:pPr>
-      <w:r>
-        <w:rPr>
-          <w:rFonts w:ascii="Consolas" w:hAnsi="Consolas"/>
-          <w:color w:val="0F52BA"/>
-          <w:sz w:val="19"/>
-          <w:szCs w:val="19"/>
-          <w:shd w:val="clear" w:color="auto" w:fill="F1F5F9"/>
-          <w:lang w:val="es-ES"/>
-        </w:rPr>
-        <w:t>AFTER UPDATE OF id_estado ON PEDIDO</w:t>
-      </w:r>
-    </w:p>
-    <w:p>
-      <w:pPr>
-        <w:pStyle w:val="HTMLconformatoprevio"/>
-        <w:pBdr>
-          <w:left w:val="single" w:sz="24" w:space="12" w:color="F59E0B"/>
-        </w:pBdr>
-        <w:shd w:val="clear" w:color="auto" w:fill="0F172A"/>
-        <w:spacing w:before="120" w:after="210"/>
-        <w:rPr>
-          <w:rFonts w:ascii="Consolas" w:hAnsi="Consolas"/>
-          <w:color w:val="0F52BA"/>
-          <w:sz w:val="19"/>
-          <w:szCs w:val="19"/>
-          <w:shd w:val="clear" w:color="auto" w:fill="F1F5F9"/>
-          <w:lang w:val="es-ES"/>
-        </w:rPr>
-      </w:pPr>
-      <w:r>
-        <w:rPr>
-          <w:rFonts w:ascii="Consolas" w:hAnsi="Consolas"/>
-          <w:color w:val="0F52BA"/>
-          <w:sz w:val="19"/>
-          <w:szCs w:val="19"/>
-          <w:shd w:val="clear" w:color="auto" w:fill="F1F5F9"/>
-          <w:lang w:val="es-ES"/>
-        </w:rPr>
-        <w:t>FOR EACH ROW</w:t>
-      </w:r>
-    </w:p>
-    <w:p>
-      <w:pPr>
-        <w:pStyle w:val="HTMLconformatoprevio"/>
-        <w:pBdr>
-          <w:left w:val="single" w:sz="24" w:space="12" w:color="F59E0B"/>
-        </w:pBdr>
-        <w:shd w:val="clear" w:color="auto" w:fill="0F172A"/>
-        <w:spacing w:before="120" w:after="210"/>
-        <w:rPr>
-          <w:rFonts w:ascii="Consolas" w:hAnsi="Consolas"/>
-          <w:color w:val="0F52BA"/>
-          <w:sz w:val="19"/>
-          <w:szCs w:val="19"/>
-          <w:shd w:val="clear" w:color="auto" w:fill="F1F5F9"/>
-          <w:lang w:val="es-ES"/>
-        </w:rPr>
-      </w:pPr>
-      <w:r>
-        <w:rPr>
-          <w:rFonts w:ascii="Consolas" w:hAnsi="Consolas"/>
-          <w:color w:val="0F52BA"/>
-          <w:sz w:val="19"/>
-          <w:szCs w:val="19"/>
-          <w:shd w:val="clear" w:color="auto" w:fill="F1F5F9"/>
-          <w:lang w:val="es-ES"/>
-        </w:rPr>
-        <w:t>BEGIN</w:t>
-      </w:r>
-    </w:p>
-    <w:p>
-      <w:pPr>
-        <w:pStyle w:val="HTMLconformatoprevio"/>
-        <w:pBdr>
-          <w:left w:val="single" w:sz="24" w:space="12" w:color="F59E0B"/>
-        </w:pBdr>
-        <w:shd w:val="clear" w:color="auto" w:fill="0F172A"/>
-        <w:spacing w:before="120" w:after="210"/>
-        <w:rPr>
-          <w:rFonts w:ascii="Consolas" w:hAnsi="Consolas"/>
-          <w:color w:val="0F52BA"/>
-          <w:sz w:val="19"/>
-          <w:szCs w:val="19"/>
-          <w:shd w:val="clear" w:color="auto" w:fill="F1F5F9"/>
-          <w:lang w:val="es-ES"/>
-        </w:rPr>
-      </w:pPr>
-      <w:r>
-        <w:rPr>
-          <w:rFonts w:ascii="Consolas" w:hAnsi="Consolas"/>
-          <w:color w:val="0F52BA"/>
-          <w:sz w:val="19"/>
-          <w:szCs w:val="19"/>
-          <w:shd w:val="clear" w:color="auto" w:fill="F1F5F9"/>
-          <w:lang w:val="es-ES"/>
-        </w:rPr>
-        <w:t xml:space="preserve">    INSERT INTO HISTORIAL_TRACKING_PEDIDO (</w:t>
+          <w:rFonts w:ascii="Consolas" w:hAnsi="Consolas"/>
+          <w:color w:val="0F52BA"/>
+          <w:sz w:val="19"/>
+          <w:szCs w:val="19"/>
+          <w:shd w:val="clear" w:color="auto" w:fill="F1F5F9"/>
+          <w:lang w:val="es-ES"/>
+        </w:rPr>
+        <w:t xml:space="preserve">   INSERT INTO HISTORIAL_TRACKING_PEDIDO (</w:t>
       </w:r>
     </w:p>
     <w:p>
@@ -8012,18 +8944,7 @@
           <w:shd w:val="clear" w:color="auto" w:fill="F1F5F9"/>
           <w:lang w:val="es-ES"/>
         </w:rPr>
-        <w:t xml:space="preserve">    </w:t>
-      </w:r>
-      <w:r>
-        <w:rPr>
-          <w:rFonts w:ascii="Consolas" w:hAnsi="Consolas"/>
-          <w:color w:val="0F52BA"/>
-          <w:sz w:val="19"/>
-          <w:szCs w:val="19"/>
-          <w:shd w:val="clear" w:color="auto" w:fill="F1F5F9"/>
-          <w:lang w:val="es-ES"/>
-        </w:rPr>
-        <w:t xml:space="preserve">    'Estado actualizado automáticamente por sistema transaccional.'</w:t>
+        <w:t xml:space="preserve">        'Estado actualizado automáticamente por sistema transaccional.'</w:t>
       </w:r>
     </w:p>
     <w:p>
@@ -8679,7 +9600,18 @@
           <w:shd w:val="clear" w:color="auto" w:fill="F1F5F9"/>
           <w:lang w:val="es-ES"/>
         </w:rPr>
-        <w:t xml:space="preserve">        id_auditoria, operacion, tabla_afectada, usuario_db, fecha, total_pedidos_actual</w:t>
+        <w:t xml:space="preserve">        </w:t>
+      </w:r>
+      <w:r>
+        <w:rPr>
+          <w:rFonts w:ascii="Consolas" w:hAnsi="Consolas"/>
+          <w:color w:val="0F52BA"/>
+          <w:sz w:val="19"/>
+          <w:szCs w:val="19"/>
+          <w:shd w:val="clear" w:color="auto" w:fill="F1F5F9"/>
+          <w:lang w:val="es-ES"/>
+        </w:rPr>
+        <w:t>id_auditoria, operacion, tabla_afectada, usuario_db, fecha, total_pedidos_actual</w:t>
       </w:r>
     </w:p>
     <w:p>
@@ -9125,18 +10057,7 @@
           <w:shd w:val="clear" w:color="auto" w:fill="F1F5F9"/>
           <w:lang w:val="es-ES"/>
         </w:rPr>
-        <w:t xml:space="preserve">   </w:t>
-      </w:r>
-      <w:r>
-        <w:rPr>
-          <w:rFonts w:ascii="Consolas" w:hAnsi="Consolas"/>
-          <w:color w:val="0F52BA"/>
-          <w:sz w:val="19"/>
-          <w:szCs w:val="19"/>
-          <w:shd w:val="clear" w:color="auto" w:fill="F1F5F9"/>
-          <w:lang w:val="es-ES"/>
-        </w:rPr>
-        <w:t xml:space="preserve"> v_total_ventas NUMBER;</w:t>
+        <w:t xml:space="preserve">    v_total_ventas NUMBER;</w:t>
       </w:r>
     </w:p>
     <w:p>
@@ -9328,7 +10249,18 @@
           <w:shd w:val="clear" w:color="auto" w:fill="F1F5F9"/>
           <w:lang w:val="es-ES"/>
         </w:rPr>
-        <w:t xml:space="preserve">            'ALERTA FINANCIERA: La nómina de sueldos ($' || v_total_nomina || </w:t>
+        <w:t xml:space="preserve">            </w:t>
+      </w:r>
+      <w:r>
+        <w:rPr>
+          <w:rFonts w:ascii="Consolas" w:hAnsi="Consolas"/>
+          <w:color w:val="0F52BA"/>
+          <w:sz w:val="19"/>
+          <w:szCs w:val="19"/>
+          <w:shd w:val="clear" w:color="auto" w:fill="F1F5F9"/>
+          <w:lang w:val="es-ES"/>
+        </w:rPr>
+        <w:t xml:space="preserve">'ALERTA FINANCIERA: La nómina de sueldos ($' || v_total_nomina || </w:t>
       </w:r>
     </w:p>
     <w:p>
@@ -9467,7 +10399,7 @@
         <w:tblLook w:val="04A0" w:firstRow="1" w:lastRow="0" w:firstColumn="1" w:lastColumn="0" w:noHBand="0" w:noVBand="1"/>
       </w:tblPr>
       <w:tblGrid>
-        <w:gridCol w:w="1115"/>
+        <w:gridCol w:w="1337"/>
         <w:gridCol w:w="5419"/>
         <w:gridCol w:w="2917"/>
         <w:gridCol w:w="1091"/>
@@ -10070,7 +11002,16 @@
                 <w:sz w:val="19"/>
                 <w:szCs w:val="19"/>
               </w:rPr>
-              <w:t>Trigger Sentencia detecta que nómina &gt; ventas y bloquea la quiebra.</w:t>
+              <w:t xml:space="preserve">Trigger Sentencia detecta que nómina </w:t>
+            </w:r>
+            <w:r>
+              <w:rPr>
+                <w:rFonts w:ascii="Calibri" w:eastAsia="Times New Roman" w:hAnsi="Calibri" w:cs="Calibri"/>
+                <w:color w:val="1F2937"/>
+                <w:sz w:val="19"/>
+                <w:szCs w:val="19"/>
+              </w:rPr>
+              <w:t>&gt; ventas y bloquea la quiebra.</w:t>
             </w:r>
           </w:p>
         </w:tc>
@@ -10731,12 +11672,166 @@
           </w:p>
         </w:tc>
       </w:tr>
+      <w:tr>
+        <w:tc>
+          <w:tcPr>
+            <w:tcW w:w="0" w:type="auto"/>
+            <w:tcBorders>
+              <w:top w:val="single" w:sz="6" w:space="0" w:color="D1D5DB"/>
+              <w:left w:val="single" w:sz="6" w:space="0" w:color="D1D5DB"/>
+              <w:bottom w:val="single" w:sz="6" w:space="0" w:color="D1D5DB"/>
+              <w:right w:val="single" w:sz="6" w:space="0" w:color="D1D5DB"/>
+            </w:tcBorders>
+            <w:tcMar>
+              <w:top w:w="105" w:type="dxa"/>
+              <w:left w:w="150" w:type="dxa"/>
+              <w:bottom w:w="105" w:type="dxa"/>
+              <w:right w:w="150" w:type="dxa"/>
+            </w:tcMar>
+            <w:hideMark/>
+          </w:tcPr>
+          <w:p>
+            <w:pPr>
+              <w:spacing w:before="210" w:after="270"/>
+              <w:rPr>
+                <w:rFonts w:ascii="Calibri" w:eastAsia="Times New Roman" w:hAnsi="Calibri" w:cs="Calibri"/>
+                <w:color w:val="1F2937"/>
+                <w:sz w:val="19"/>
+                <w:szCs w:val="19"/>
+              </w:rPr>
+            </w:pPr>
+            <w:r>
+              <w:rPr>
+                <w:rStyle w:val="Fuerte"/>
+                <w:rFonts w:ascii="Calibri" w:eastAsia="Times New Roman" w:hAnsi="Calibri" w:cs="Calibri"/>
+                <w:color w:val="1F2937"/>
+                <w:sz w:val="19"/>
+                <w:szCs w:val="19"/>
+              </w:rPr>
+              <w:t>8. Vista Semántica de Trabajadores</w:t>
+            </w:r>
+          </w:p>
+        </w:tc>
+        <w:tc>
+          <w:tcPr>
+            <w:tcW w:w="0" w:type="auto"/>
+            <w:tcBorders>
+              <w:top w:val="single" w:sz="6" w:space="0" w:color="D1D5DB"/>
+              <w:left w:val="single" w:sz="6" w:space="0" w:color="D1D5DB"/>
+              <w:bottom w:val="single" w:sz="6" w:space="0" w:color="D1D5DB"/>
+              <w:right w:val="single" w:sz="6" w:space="0" w:color="D1D5DB"/>
+            </w:tcBorders>
+            <w:tcMar>
+              <w:top w:w="105" w:type="dxa"/>
+              <w:left w:w="150" w:type="dxa"/>
+              <w:bottom w:w="105" w:type="dxa"/>
+              <w:right w:w="150" w:type="dxa"/>
+            </w:tcMar>
+            <w:hideMark/>
+          </w:tcPr>
+          <w:p>
+            <w:pPr>
+              <w:spacing w:before="210" w:after="270"/>
+              <w:rPr>
+                <w:rFonts w:ascii="Calibri" w:eastAsia="Times New Roman" w:hAnsi="Calibri" w:cs="Calibri"/>
+                <w:color w:val="1F2937"/>
+                <w:sz w:val="19"/>
+                <w:szCs w:val="19"/>
+              </w:rPr>
+            </w:pPr>
+            <w:r>
+              <w:rPr>
+                <w:rStyle w:val="CdigoHTML"/>
+              </w:rPr>
+              <w:t>SELECT id_trabajador, trabajador, sueldo_base FROM V_TRABAJADORES;</w:t>
+            </w:r>
+          </w:p>
+        </w:tc>
+        <w:tc>
+          <w:tcPr>
+            <w:tcW w:w="0" w:type="auto"/>
+            <w:tcBorders>
+              <w:top w:val="single" w:sz="6" w:space="0" w:color="D1D5DB"/>
+              <w:left w:val="single" w:sz="6" w:space="0" w:color="D1D5DB"/>
+              <w:bottom w:val="single" w:sz="6" w:space="0" w:color="D1D5DB"/>
+              <w:right w:val="single" w:sz="6" w:space="0" w:color="D1D5DB"/>
+            </w:tcBorders>
+            <w:tcMar>
+              <w:top w:w="105" w:type="dxa"/>
+              <w:left w:w="150" w:type="dxa"/>
+              <w:bottom w:w="105" w:type="dxa"/>
+              <w:right w:w="150" w:type="dxa"/>
+            </w:tcMar>
+            <w:hideMark/>
+          </w:tcPr>
+          <w:p>
+            <w:pPr>
+              <w:spacing w:before="210" w:after="270"/>
+              <w:rPr>
+                <w:rFonts w:ascii="Calibri" w:eastAsia="Times New Roman" w:hAnsi="Calibri" w:cs="Calibri"/>
+                <w:color w:val="1F2937"/>
+                <w:sz w:val="19"/>
+                <w:szCs w:val="19"/>
+              </w:rPr>
+            </w:pPr>
+            <w:r>
+              <w:rPr>
+                <w:rFonts w:ascii="Calibri" w:eastAsia="Times New Roman" w:hAnsi="Calibri" w:cs="Calibri"/>
+                <w:color w:val="1F2937"/>
+                <w:sz w:val="19"/>
+                <w:szCs w:val="19"/>
+              </w:rPr>
+              <w:t>Vista que expone directamente ID_TRABAJADOR humanizado en vez de id_usuario.</w:t>
+            </w:r>
+          </w:p>
+        </w:tc>
+        <w:tc>
+          <w:tcPr>
+            <w:tcW w:w="0" w:type="auto"/>
+            <w:tcBorders>
+              <w:top w:val="single" w:sz="6" w:space="0" w:color="D1D5DB"/>
+              <w:left w:val="single" w:sz="6" w:space="0" w:color="D1D5DB"/>
+              <w:bottom w:val="single" w:sz="6" w:space="0" w:color="D1D5DB"/>
+              <w:right w:val="single" w:sz="6" w:space="0" w:color="D1D5DB"/>
+            </w:tcBorders>
+            <w:tcMar>
+              <w:top w:w="105" w:type="dxa"/>
+              <w:left w:w="150" w:type="dxa"/>
+              <w:bottom w:w="105" w:type="dxa"/>
+              <w:right w:w="150" w:type="dxa"/>
+            </w:tcMar>
+            <w:hideMark/>
+          </w:tcPr>
+          <w:p>
+            <w:pPr>
+              <w:spacing w:before="210" w:after="270"/>
+              <w:rPr>
+                <w:rFonts w:ascii="Calibri" w:eastAsia="Times New Roman" w:hAnsi="Calibri" w:cs="Calibri"/>
+                <w:color w:val="1F2937"/>
+                <w:sz w:val="19"/>
+                <w:szCs w:val="19"/>
+              </w:rPr>
+            </w:pPr>
+            <w:r>
+              <w:rPr>
+                <w:rFonts w:ascii="Calibri" w:eastAsia="Times New Roman" w:hAnsi="Calibri" w:cs="Calibri"/>
+                <w:b/>
+                <w:bCs/>
+                <w:color w:val="059669"/>
+                <w:sz w:val="19"/>
+                <w:szCs w:val="19"/>
+              </w:rPr>
+              <w:t>OK: Vista</w:t>
+            </w:r>
+          </w:p>
+        </w:tc>
+      </w:tr>
     </w:tbl>
     <w:p>
       <w:pPr>
         <w:shd w:val="clear" w:color="auto" w:fill="EFF6FF"/>
         <w:spacing w:before="180" w:after="60"/>
-        <w:divId w:val="2045903833"/>
+        <w:divId w:val="1484082178"/>
         <w:rPr>
           <w:rFonts w:ascii="Calibri" w:eastAsia="Times New Roman" w:hAnsi="Calibri" w:cs="Calibri"/>
           <w:b/>
@@ -10764,7 +11859,7 @@
       <w:pPr>
         <w:shd w:val="clear" w:color="auto" w:fill="EFF6FF"/>
         <w:spacing w:after="210"/>
-        <w:divId w:val="570307565"/>
+        <w:divId w:val="118887010"/>
         <w:rPr>
           <w:rFonts w:ascii="Calibri" w:eastAsia="Times New Roman" w:hAnsi="Calibri" w:cs="Calibri"/>
           <w:color w:val="1F2937"/>
@@ -10802,7 +11897,17 @@
           <w:szCs w:val="22"/>
           <w:lang w:val="es-ES"/>
         </w:rPr>
-        <w:t xml:space="preserve"> y </w:t>
+        <w:t xml:space="preserve"> </w:t>
+      </w:r>
+      <w:r>
+        <w:rPr>
+          <w:rFonts w:ascii="Calibri" w:eastAsia="Times New Roman" w:hAnsi="Calibri" w:cs="Calibri"/>
+          <w:color w:val="1F2937"/>
+          <w:sz w:val="22"/>
+          <w:szCs w:val="22"/>
+          <w:lang w:val="es-ES"/>
+        </w:rPr>
+        <w:t xml:space="preserve">y </w:t>
       </w:r>
       <w:r>
         <w:rPr>
@@ -10913,17 +12018,7 @@
           <w:szCs w:val="22"/>
           <w:lang w:val="es-ES"/>
         </w:rPr>
-        <w:t xml:space="preserve"> </w:t>
-      </w:r>
-      <w:r>
-        <w:rPr>
-          <w:rFonts w:ascii="Calibri" w:eastAsia="Times New Roman" w:hAnsi="Calibri" w:cs="Calibri"/>
-          <w:color w:val="1F2937"/>
-          <w:sz w:val="22"/>
-          <w:szCs w:val="22"/>
-          <w:lang w:val="es-ES"/>
-        </w:rPr>
-        <w:t>La lógica de negocio fue trasladada en un 100% al motor Oracle Cloud Autonomous Database. Ninguna aplicación cliente puede alterar sueldos ilegalmente ni generar inconsistencias operativas.</w:t>
+        <w:t xml:space="preserve"> La lógica de negocio fue trasladada en un 100% al motor Oracle Cloud Autonomous Database. Ninguna aplicación cliente puede alterar sueldos ilegalmente ni generar inconsistencias operativas.</w:t>
       </w:r>
     </w:p>
     <w:p>
@@ -11031,17 +12126,7 @@
           <w:szCs w:val="22"/>
           <w:lang w:val="es-ES"/>
         </w:rPr>
-        <w:t xml:space="preserve"> </w:t>
-      </w:r>
-      <w:r>
-        <w:rPr>
-          <w:rFonts w:ascii="Calibri" w:eastAsia="Times New Roman" w:hAnsi="Calibri" w:cs="Calibri"/>
-          <w:color w:val="1F2937"/>
-          <w:sz w:val="22"/>
-          <w:szCs w:val="22"/>
-          <w:lang w:val="es-ES"/>
-        </w:rPr>
-        <w:t>Los triggers de sentencia evitan pérdidas operacionales y riesgo de quiebra, resolviendo el control de nómina vs. ventas sin incurrir en error de tabla mutante.</w:t>
+        <w:t xml:space="preserve"> Los triggers de sentencia evitan pérdidas operacionales y riesgo de quiebra, resolviendo el control de nómina vs. ventas sin incurrir en error de tabla mutante.</w:t>
       </w:r>
     </w:p>
     <w:p>
@@ -11095,7 +12180,17 @@
           <w:szCs w:val="22"/>
           <w:lang w:val="es-ES"/>
         </w:rPr>
-        <w:t xml:space="preserve"> organiza los subprogramas en una interfaz pública limpia y constructores privados protegidos.</w:t>
+        <w:t xml:space="preserve"> </w:t>
+      </w:r>
+      <w:r>
+        <w:rPr>
+          <w:rFonts w:ascii="Calibri" w:eastAsia="Times New Roman" w:hAnsi="Calibri" w:cs="Calibri"/>
+          <w:color w:val="1F2937"/>
+          <w:sz w:val="22"/>
+          <w:szCs w:val="22"/>
+          <w:lang w:val="es-ES"/>
+        </w:rPr>
+        <w:t>organiza los subprogramas en una interfaz pública limpia y constructores privados protegidos.</w:t>
       </w:r>
     </w:p>
     <w:p>
@@ -11149,9 +12244,271 @@
 <file path=word/numbering.xml><?xml version="1.0" encoding="utf-8"?>
 <w:numbering xmlns:wpc="http://schemas.microsoft.com/office/word/2010/wordprocessingCanvas" xmlns:cx="http://schemas.microsoft.com/office/drawing/2014/chartex" xmlns:cx1="http://schemas.microsoft.com/office/drawing/2015/9/8/chartex" xmlns:cx2="http://schemas.microsoft.com/office/drawing/2015/10/21/chartex" xmlns:cx3="http://schemas.microsoft.com/office/drawing/2016/5/9/chartex" xmlns:cx4="http://schemas.microsoft.com/office/drawing/2016/5/10/chartex" xmlns:cx5="http://schemas.microsoft.com/office/drawing/2016/5/11/chartex" xmlns:cx6="http://schemas.microsoft.com/office/drawing/2016/5/12/chartex" xmlns:cx7="http://schemas.microsoft.com/office/drawing/2016/5/13/chartex" xmlns:cx8="http://schemas.microsoft.com/office/drawing/2016/5/14/chartex" xmlns:mc="http://schemas.openxmlformats.org/markup-compatibility/2006" xmlns:aink="http://schemas.microsoft.com/office/drawing/2016/ink" xmlns:am3d="http://schemas.microsoft.com/office/drawing/2017/model3d" xmlns:o="urn:schemas-microsoft-com:office:office" xmlns:oel="http://schemas.microsoft.com/office/2019/extlst" xmlns:r="http://schemas.openxmlformats.org/officeDocument/2006/relationships" xmlns:m="http://schemas.openxmlformats.org/officeDocument/2006/math" xmlns:v="urn:schemas-microsoft-com:vml" xmlns:wp14="http://schemas.microsoft.com/office/word/2010/wordprocessingDrawing" xmlns:wp="http://schemas.openxmlformats.org/drawingml/2006/wordprocessingDrawing" xmlns:w10="urn:schemas-microsoft-com:office:word" xmlns:w="http://schemas.openxmlformats.org/wordprocessingml/2006/main" xmlns:w14="http://schemas.microsoft.com/office/word/2010/wordml" xmlns:w15="http://schemas.microsoft.com/office/word/2012/wordml" xmlns:w16cex="http://schemas.microsoft.com/office/word/2018/wordml/cex" xmlns:w16cid="http://schemas.microsoft.com/office/word/2016/wordml/cid" xmlns:w16="http://schemas.microsoft.com/office/word/2018/wordml" xmlns:w16du="http://schemas.microsoft.com/office/word/2023/wordml/word16du" xmlns:w16sdtdh="http://schemas.microsoft.com/office/word/2020/wordml/sdtdatahash" xmlns:w16sdtfl="http://schemas.microsoft.com/office/word/2024/wordml/sdtformatlock" xmlns:w16se="http://schemas.microsoft.com/office/word/2015/wordml/symex" xmlns:wpg="http://schemas.microsoft.com/office/word/2010/wordprocessingGroup" xmlns:wpi="http://schemas.microsoft.com/office/word/2010/wordprocessingInk" xmlns:wne="http://schemas.microsoft.com/office/word/2006/wordml" xmlns:wps="http://schemas.microsoft.com/office/word/2010/wordprocessingShape" mc:Ignorable="w14 w15 w16se w16cid w16 w16cex w16sdtdh w16sdtfl w16du wp14">
   <w:abstractNum w:abstractNumId="0" w15:restartNumberingAfterBreak="0">
-    <w:nsid w:val="05983915"/>
+    <w:nsid w:val="41307FC3"/>
     <w:multiLevelType w:val="multilevel"/>
-    <w:tmpl w:val="93BE48B6"/>
+    <w:tmpl w:val="7CE82E1C"/>
+    <w:lvl w:ilvl="0">
+      <w:start w:val="1"/>
+      <w:numFmt w:val="bullet"/>
+      <w:lvlText w:val=""/>
+      <w:lvlJc w:val="left"/>
+      <w:pPr>
+        <w:tabs>
+          <w:tab w:val="num" w:pos="720"/>
+        </w:tabs>
+        <w:ind w:left="720" w:hanging="360"/>
+      </w:pPr>
+      <w:rPr>
+        <w:rFonts w:ascii="Symbol" w:hAnsi="Symbol" w:hint="default"/>
+        <w:sz w:val="20"/>
+      </w:rPr>
+    </w:lvl>
+    <w:lvl w:ilvl="1">
+      <w:start w:val="1"/>
+      <w:numFmt w:val="bullet"/>
+      <w:lvlText w:val="o"/>
+      <w:lvlJc w:val="left"/>
+      <w:pPr>
+        <w:tabs>
+          <w:tab w:val="num" w:pos="1440"/>
+        </w:tabs>
+        <w:ind w:left="1440" w:hanging="360"/>
+      </w:pPr>
+      <w:rPr>
+        <w:rFonts w:ascii="Courier New" w:hAnsi="Courier New" w:hint="default"/>
+        <w:sz w:val="20"/>
+      </w:rPr>
+    </w:lvl>
+    <w:lvl w:ilvl="2" w:tentative="1">
+      <w:start w:val="1"/>
+      <w:numFmt w:val="bullet"/>
+      <w:lvlText w:val=""/>
+      <w:lvlJc w:val="left"/>
+      <w:pPr>
+        <w:tabs>
+          <w:tab w:val="num" w:pos="2160"/>
+        </w:tabs>
+        <w:ind w:left="2160" w:hanging="360"/>
+      </w:pPr>
+      <w:rPr>
+        <w:rFonts w:ascii="Wingdings" w:hAnsi="Wingdings" w:hint="default"/>
+        <w:sz w:val="20"/>
+      </w:rPr>
+    </w:lvl>
+    <w:lvl w:ilvl="3" w:tentative="1">
+      <w:start w:val="1"/>
+      <w:numFmt w:val="bullet"/>
+      <w:lvlText w:val=""/>
+      <w:lvlJc w:val="left"/>
+      <w:pPr>
+        <w:tabs>
+          <w:tab w:val="num" w:pos="2880"/>
+        </w:tabs>
+        <w:ind w:left="2880" w:hanging="360"/>
+      </w:pPr>
+      <w:rPr>
+        <w:rFonts w:ascii="Wingdings" w:hAnsi="Wingdings" w:hint="default"/>
+        <w:sz w:val="20"/>
+      </w:rPr>
+    </w:lvl>
+    <w:lvl w:ilvl="4" w:tentative="1">
+      <w:start w:val="1"/>
+      <w:numFmt w:val="bullet"/>
+      <w:lvlText w:val=""/>
+      <w:lvlJc w:val="left"/>
+      <w:pPr>
+        <w:tabs>
+          <w:tab w:val="num" w:pos="3600"/>
+        </w:tabs>
+        <w:ind w:left="3600" w:hanging="360"/>
+      </w:pPr>
+      <w:rPr>
+        <w:rFonts w:ascii="Wingdings" w:hAnsi="Wingdings" w:hint="default"/>
+        <w:sz w:val="20"/>
+      </w:rPr>
+    </w:lvl>
+    <w:lvl w:ilvl="5" w:tentative="1">
+      <w:start w:val="1"/>
+      <w:numFmt w:val="bullet"/>
+      <w:lvlText w:val=""/>
+      <w:lvlJc w:val="left"/>
+      <w:pPr>
+        <w:tabs>
+          <w:tab w:val="num" w:pos="4320"/>
+        </w:tabs>
+        <w:ind w:left="4320" w:hanging="360"/>
+      </w:pPr>
+      <w:rPr>
+        <w:rFonts w:ascii="Wingdings" w:hAnsi="Wingdings" w:hint="default"/>
+        <w:sz w:val="20"/>
+      </w:rPr>
+    </w:lvl>
+    <w:lvl w:ilvl="6" w:tentative="1">
+      <w:start w:val="1"/>
+      <w:numFmt w:val="bullet"/>
+      <w:lvlText w:val=""/>
+      <w:lvlJc w:val="left"/>
+      <w:pPr>
+        <w:tabs>
+          <w:tab w:val="num" w:pos="5040"/>
+        </w:tabs>
+        <w:ind w:left="5040" w:hanging="360"/>
+      </w:pPr>
+      <w:rPr>
+        <w:rFonts w:ascii="Wingdings" w:hAnsi="Wingdings" w:hint="default"/>
+        <w:sz w:val="20"/>
+      </w:rPr>
+    </w:lvl>
+    <w:lvl w:ilvl="7" w:tentative="1">
+      <w:start w:val="1"/>
+      <w:numFmt w:val="bullet"/>
+      <w:lvlText w:val=""/>
+      <w:lvlJc w:val="left"/>
+      <w:pPr>
+        <w:tabs>
+          <w:tab w:val="num" w:pos="5760"/>
+        </w:tabs>
+        <w:ind w:left="5760" w:hanging="360"/>
+      </w:pPr>
+      <w:rPr>
+        <w:rFonts w:ascii="Wingdings" w:hAnsi="Wingdings" w:hint="default"/>
+        <w:sz w:val="20"/>
+      </w:rPr>
+    </w:lvl>
+    <w:lvl w:ilvl="8" w:tentative="1">
+      <w:start w:val="1"/>
+      <w:numFmt w:val="bullet"/>
+      <w:lvlText w:val=""/>
+      <w:lvlJc w:val="left"/>
+      <w:pPr>
+        <w:tabs>
+          <w:tab w:val="num" w:pos="6480"/>
+        </w:tabs>
+        <w:ind w:left="6480" w:hanging="360"/>
+      </w:pPr>
+      <w:rPr>
+        <w:rFonts w:ascii="Wingdings" w:hAnsi="Wingdings" w:hint="default"/>
+        <w:sz w:val="20"/>
+      </w:rPr>
+    </w:lvl>
+  </w:abstractNum>
+  <w:abstractNum w:abstractNumId="1" w15:restartNumberingAfterBreak="0">
+    <w:nsid w:val="54423C31"/>
+    <w:multiLevelType w:val="multilevel"/>
+    <w:tmpl w:val="C02CDCE0"/>
+    <w:lvl w:ilvl="0">
+      <w:start w:val="1"/>
+      <w:numFmt w:val="decimal"/>
+      <w:lvlText w:val="%1."/>
+      <w:lvlJc w:val="left"/>
+      <w:pPr>
+        <w:tabs>
+          <w:tab w:val="num" w:pos="720"/>
+        </w:tabs>
+        <w:ind w:left="720" w:hanging="360"/>
+      </w:pPr>
+    </w:lvl>
+    <w:lvl w:ilvl="1" w:tentative="1">
+      <w:start w:val="1"/>
+      <w:numFmt w:val="decimal"/>
+      <w:lvlText w:val="%2."/>
+      <w:lvlJc w:val="left"/>
+      <w:pPr>
+        <w:tabs>
+          <w:tab w:val="num" w:pos="1440"/>
+        </w:tabs>
+        <w:ind w:left="1440" w:hanging="360"/>
+      </w:pPr>
+    </w:lvl>
+    <w:lvl w:ilvl="2" w:tentative="1">
+      <w:start w:val="1"/>
+      <w:numFmt w:val="decimal"/>
+      <w:lvlText w:val="%3."/>
+      <w:lvlJc w:val="left"/>
+      <w:pPr>
+        <w:tabs>
+          <w:tab w:val="num" w:pos="2160"/>
+        </w:tabs>
+        <w:ind w:left="2160" w:hanging="360"/>
+      </w:pPr>
+    </w:lvl>
+    <w:lvl w:ilvl="3" w:tentative="1">
+      <w:start w:val="1"/>
+      <w:numFmt w:val="decimal"/>
+      <w:lvlText w:val="%4."/>
+      <w:lvlJc w:val="left"/>
+      <w:pPr>
+        <w:tabs>
+          <w:tab w:val="num" w:pos="2880"/>
+        </w:tabs>
+        <w:ind w:left="2880" w:hanging="360"/>
+      </w:pPr>
+    </w:lvl>
+    <w:lvl w:ilvl="4" w:tentative="1">
+      <w:start w:val="1"/>
+      <w:numFmt w:val="decimal"/>
+      <w:lvlText w:val="%5."/>
+      <w:lvlJc w:val="left"/>
+      <w:pPr>
+        <w:tabs>
+          <w:tab w:val="num" w:pos="3600"/>
+        </w:tabs>
+        <w:ind w:left="3600" w:hanging="360"/>
+      </w:pPr>
+    </w:lvl>
+    <w:lvl w:ilvl="5" w:tentative="1">
+      <w:start w:val="1"/>
+      <w:numFmt w:val="decimal"/>
+      <w:lvlText w:val="%6."/>
+      <w:lvlJc w:val="left"/>
+      <w:pPr>
+        <w:tabs>
+          <w:tab w:val="num" w:pos="4320"/>
+        </w:tabs>
+        <w:ind w:left="4320" w:hanging="360"/>
+      </w:pPr>
+    </w:lvl>
+    <w:lvl w:ilvl="6" w:tentative="1">
+      <w:start w:val="1"/>
+      <w:numFmt w:val="decimal"/>
+      <w:lvlText w:val="%7."/>
+      <w:lvlJc w:val="left"/>
+      <w:pPr>
+        <w:tabs>
+          <w:tab w:val="num" w:pos="5040"/>
+        </w:tabs>
+        <w:ind w:left="5040" w:hanging="360"/>
+      </w:pPr>
+    </w:lvl>
+    <w:lvl w:ilvl="7" w:tentative="1">
+      <w:start w:val="1"/>
+      <w:numFmt w:val="decimal"/>
+      <w:lvlText w:val="%8."/>
+      <w:lvlJc w:val="left"/>
+      <w:pPr>
+        <w:tabs>
+          <w:tab w:val="num" w:pos="5760"/>
+        </w:tabs>
+        <w:ind w:left="5760" w:hanging="360"/>
+      </w:pPr>
+    </w:lvl>
+    <w:lvl w:ilvl="8" w:tentative="1">
+      <w:start w:val="1"/>
+      <w:numFmt w:val="decimal"/>
+      <w:lvlText w:val="%9."/>
+      <w:lvlJc w:val="left"/>
+      <w:pPr>
+        <w:tabs>
+          <w:tab w:val="num" w:pos="6480"/>
+        </w:tabs>
+        <w:ind w:left="6480" w:hanging="360"/>
+      </w:pPr>
+    </w:lvl>
+  </w:abstractNum>
+  <w:abstractNum w:abstractNumId="2" w15:restartNumberingAfterBreak="0">
+    <w:nsid w:val="5D3C20CC"/>
+    <w:multiLevelType w:val="multilevel"/>
+    <w:tmpl w:val="9BC2F8E6"/>
     <w:lvl w:ilvl="0">
       <w:start w:val="1"/>
       <w:numFmt w:val="bullet"/>
@@ -11297,10 +12654,10 @@
       </w:rPr>
     </w:lvl>
   </w:abstractNum>
-  <w:abstractNum w:abstractNumId="1" w15:restartNumberingAfterBreak="0">
-    <w:nsid w:val="254D4739"/>
+  <w:abstractNum w:abstractNumId="3" w15:restartNumberingAfterBreak="0">
+    <w:nsid w:val="5FC847A2"/>
     <w:multiLevelType w:val="multilevel"/>
-    <w:tmpl w:val="37201B7E"/>
+    <w:tmpl w:val="8702EE12"/>
     <w:lvl w:ilvl="0">
       <w:start w:val="1"/>
       <w:numFmt w:val="decimal"/>
@@ -11410,123 +12767,10 @@
       </w:pPr>
     </w:lvl>
   </w:abstractNum>
-  <w:abstractNum w:abstractNumId="2" w15:restartNumberingAfterBreak="0">
-    <w:nsid w:val="2E5953FC"/>
+  <w:abstractNum w:abstractNumId="4" w15:restartNumberingAfterBreak="0">
+    <w:nsid w:val="73752D2D"/>
     <w:multiLevelType w:val="multilevel"/>
-    <w:tmpl w:val="574C506E"/>
-    <w:lvl w:ilvl="0">
-      <w:start w:val="1"/>
-      <w:numFmt w:val="decimal"/>
-      <w:lvlText w:val="%1."/>
-      <w:lvlJc w:val="left"/>
-      <w:pPr>
-        <w:tabs>
-          <w:tab w:val="num" w:pos="720"/>
-        </w:tabs>
-        <w:ind w:left="720" w:hanging="360"/>
-      </w:pPr>
-    </w:lvl>
-    <w:lvl w:ilvl="1" w:tentative="1">
-      <w:start w:val="1"/>
-      <w:numFmt w:val="decimal"/>
-      <w:lvlText w:val="%2."/>
-      <w:lvlJc w:val="left"/>
-      <w:pPr>
-        <w:tabs>
-          <w:tab w:val="num" w:pos="1440"/>
-        </w:tabs>
-        <w:ind w:left="1440" w:hanging="360"/>
-      </w:pPr>
-    </w:lvl>
-    <w:lvl w:ilvl="2" w:tentative="1">
-      <w:start w:val="1"/>
-      <w:numFmt w:val="decimal"/>
-      <w:lvlText w:val="%3."/>
-      <w:lvlJc w:val="left"/>
-      <w:pPr>
-        <w:tabs>
-          <w:tab w:val="num" w:pos="2160"/>
-        </w:tabs>
-        <w:ind w:left="2160" w:hanging="360"/>
-      </w:pPr>
-    </w:lvl>
-    <w:lvl w:ilvl="3" w:tentative="1">
-      <w:start w:val="1"/>
-      <w:numFmt w:val="decimal"/>
-      <w:lvlText w:val="%4."/>
-      <w:lvlJc w:val="left"/>
-      <w:pPr>
-        <w:tabs>
-          <w:tab w:val="num" w:pos="2880"/>
-        </w:tabs>
-        <w:ind w:left="2880" w:hanging="360"/>
-      </w:pPr>
-    </w:lvl>
-    <w:lvl w:ilvl="4" w:tentative="1">
-      <w:start w:val="1"/>
-      <w:numFmt w:val="decimal"/>
-      <w:lvlText w:val="%5."/>
-      <w:lvlJc w:val="left"/>
-      <w:pPr>
-        <w:tabs>
-          <w:tab w:val="num" w:pos="3600"/>
-        </w:tabs>
-        <w:ind w:left="3600" w:hanging="360"/>
-      </w:pPr>
-    </w:lvl>
-    <w:lvl w:ilvl="5" w:tentative="1">
-      <w:start w:val="1"/>
-      <w:numFmt w:val="decimal"/>
-      <w:lvlText w:val="%6."/>
-      <w:lvlJc w:val="left"/>
-      <w:pPr>
-        <w:tabs>
-          <w:tab w:val="num" w:pos="4320"/>
-        </w:tabs>
-        <w:ind w:left="4320" w:hanging="360"/>
-      </w:pPr>
-    </w:lvl>
-    <w:lvl w:ilvl="6" w:tentative="1">
-      <w:start w:val="1"/>
-      <w:numFmt w:val="decimal"/>
-      <w:lvlText w:val="%7."/>
-      <w:lvlJc w:val="left"/>
-      <w:pPr>
-        <w:tabs>
-          <w:tab w:val="num" w:pos="5040"/>
-        </w:tabs>
-        <w:ind w:left="5040" w:hanging="360"/>
-      </w:pPr>
-    </w:lvl>
-    <w:lvl w:ilvl="7" w:tentative="1">
-      <w:start w:val="1"/>
-      <w:numFmt w:val="decimal"/>
-      <w:lvlText w:val="%8."/>
-      <w:lvlJc w:val="left"/>
-      <w:pPr>
-        <w:tabs>
-          <w:tab w:val="num" w:pos="5760"/>
-        </w:tabs>
-        <w:ind w:left="5760" w:hanging="360"/>
-      </w:pPr>
-    </w:lvl>
-    <w:lvl w:ilvl="8" w:tentative="1">
-      <w:start w:val="1"/>
-      <w:numFmt w:val="decimal"/>
-      <w:lvlText w:val="%9."/>
-      <w:lvlJc w:val="left"/>
-      <w:pPr>
-        <w:tabs>
-          <w:tab w:val="num" w:pos="6480"/>
-        </w:tabs>
-        <w:ind w:left="6480" w:hanging="360"/>
-      </w:pPr>
-    </w:lvl>
-  </w:abstractNum>
-  <w:abstractNum w:abstractNumId="3" w15:restartNumberingAfterBreak="0">
-    <w:nsid w:val="525D722A"/>
-    <w:multiLevelType w:val="multilevel"/>
-    <w:tmpl w:val="28E8D0F0"/>
+    <w:tmpl w:val="A90232E6"/>
     <w:lvl w:ilvl="0">
       <w:start w:val="1"/>
       <w:numFmt w:val="bullet"/>
@@ -11672,169 +12916,20 @@
       </w:rPr>
     </w:lvl>
   </w:abstractNum>
-  <w:abstractNum w:abstractNumId="4" w15:restartNumberingAfterBreak="0">
-    <w:nsid w:val="610D68BC"/>
-    <w:multiLevelType w:val="multilevel"/>
-    <w:tmpl w:val="65504538"/>
-    <w:lvl w:ilvl="0">
-      <w:start w:val="1"/>
-      <w:numFmt w:val="bullet"/>
-      <w:lvlText w:val=""/>
-      <w:lvlJc w:val="left"/>
-      <w:pPr>
-        <w:tabs>
-          <w:tab w:val="num" w:pos="720"/>
-        </w:tabs>
-        <w:ind w:left="720" w:hanging="360"/>
-      </w:pPr>
-      <w:rPr>
-        <w:rFonts w:ascii="Symbol" w:hAnsi="Symbol" w:hint="default"/>
-        <w:sz w:val="20"/>
-      </w:rPr>
-    </w:lvl>
-    <w:lvl w:ilvl="1">
-      <w:start w:val="1"/>
-      <w:numFmt w:val="bullet"/>
-      <w:lvlText w:val="o"/>
-      <w:lvlJc w:val="left"/>
-      <w:pPr>
-        <w:tabs>
-          <w:tab w:val="num" w:pos="1440"/>
-        </w:tabs>
-        <w:ind w:left="1440" w:hanging="360"/>
-      </w:pPr>
-      <w:rPr>
-        <w:rFonts w:ascii="Courier New" w:hAnsi="Courier New" w:hint="default"/>
-        <w:sz w:val="20"/>
-      </w:rPr>
-    </w:lvl>
-    <w:lvl w:ilvl="2" w:tentative="1">
-      <w:start w:val="1"/>
-      <w:numFmt w:val="bullet"/>
-      <w:lvlText w:val=""/>
-      <w:lvlJc w:val="left"/>
-      <w:pPr>
-        <w:tabs>
-          <w:tab w:val="num" w:pos="2160"/>
-        </w:tabs>
-        <w:ind w:left="2160" w:hanging="360"/>
-      </w:pPr>
-      <w:rPr>
-        <w:rFonts w:ascii="Wingdings" w:hAnsi="Wingdings" w:hint="default"/>
-        <w:sz w:val="20"/>
-      </w:rPr>
-    </w:lvl>
-    <w:lvl w:ilvl="3" w:tentative="1">
-      <w:start w:val="1"/>
-      <w:numFmt w:val="bullet"/>
-      <w:lvlText w:val=""/>
-      <w:lvlJc w:val="left"/>
-      <w:pPr>
-        <w:tabs>
-          <w:tab w:val="num" w:pos="2880"/>
-        </w:tabs>
-        <w:ind w:left="2880" w:hanging="360"/>
-      </w:pPr>
-      <w:rPr>
-        <w:rFonts w:ascii="Wingdings" w:hAnsi="Wingdings" w:hint="default"/>
-        <w:sz w:val="20"/>
-      </w:rPr>
-    </w:lvl>
-    <w:lvl w:ilvl="4" w:tentative="1">
-      <w:start w:val="1"/>
-      <w:numFmt w:val="bullet"/>
-      <w:lvlText w:val=""/>
-      <w:lvlJc w:val="left"/>
-      <w:pPr>
-        <w:tabs>
-          <w:tab w:val="num" w:pos="3600"/>
-        </w:tabs>
-        <w:ind w:left="3600" w:hanging="360"/>
-      </w:pPr>
-      <w:rPr>
-        <w:rFonts w:ascii="Wingdings" w:hAnsi="Wingdings" w:hint="default"/>
-        <w:sz w:val="20"/>
-      </w:rPr>
-    </w:lvl>
-    <w:lvl w:ilvl="5" w:tentative="1">
-      <w:start w:val="1"/>
-      <w:numFmt w:val="bullet"/>
-      <w:lvlText w:val=""/>
-      <w:lvlJc w:val="left"/>
-      <w:pPr>
-        <w:tabs>
-          <w:tab w:val="num" w:pos="4320"/>
-        </w:tabs>
-        <w:ind w:left="4320" w:hanging="360"/>
-      </w:pPr>
-      <w:rPr>
-        <w:rFonts w:ascii="Wingdings" w:hAnsi="Wingdings" w:hint="default"/>
-        <w:sz w:val="20"/>
-      </w:rPr>
-    </w:lvl>
-    <w:lvl w:ilvl="6" w:tentative="1">
-      <w:start w:val="1"/>
-      <w:numFmt w:val="bullet"/>
-      <w:lvlText w:val=""/>
-      <w:lvlJc w:val="left"/>
-      <w:pPr>
-        <w:tabs>
-          <w:tab w:val="num" w:pos="5040"/>
-        </w:tabs>
-        <w:ind w:left="5040" w:hanging="360"/>
-      </w:pPr>
-      <w:rPr>
-        <w:rFonts w:ascii="Wingdings" w:hAnsi="Wingdings" w:hint="default"/>
-        <w:sz w:val="20"/>
-      </w:rPr>
-    </w:lvl>
-    <w:lvl w:ilvl="7" w:tentative="1">
-      <w:start w:val="1"/>
-      <w:numFmt w:val="bullet"/>
-      <w:lvlText w:val=""/>
-      <w:lvlJc w:val="left"/>
-      <w:pPr>
-        <w:tabs>
-          <w:tab w:val="num" w:pos="5760"/>
-        </w:tabs>
-        <w:ind w:left="5760" w:hanging="360"/>
-      </w:pPr>
-      <w:rPr>
-        <w:rFonts w:ascii="Wingdings" w:hAnsi="Wingdings" w:hint="default"/>
-        <w:sz w:val="20"/>
-      </w:rPr>
-    </w:lvl>
-    <w:lvl w:ilvl="8" w:tentative="1">
-      <w:start w:val="1"/>
-      <w:numFmt w:val="bullet"/>
-      <w:lvlText w:val=""/>
-      <w:lvlJc w:val="left"/>
-      <w:pPr>
-        <w:tabs>
-          <w:tab w:val="num" w:pos="6480"/>
-        </w:tabs>
-        <w:ind w:left="6480" w:hanging="360"/>
-      </w:pPr>
-      <w:rPr>
-        <w:rFonts w:ascii="Wingdings" w:hAnsi="Wingdings" w:hint="default"/>
-        <w:sz w:val="20"/>
-      </w:rPr>
-    </w:lvl>
-  </w:abstractNum>
-  <w:num w:numId="1" w16cid:durableId="53359107">
+  <w:num w:numId="1" w16cid:durableId="698093294">
+    <w:abstractNumId w:val="2"/>
+  </w:num>
+  <w:num w:numId="2" w16cid:durableId="2136559285">
+    <w:abstractNumId w:val="4"/>
+  </w:num>
+  <w:num w:numId="3" w16cid:durableId="1575048352">
+    <w:abstractNumId w:val="3"/>
+  </w:num>
+  <w:num w:numId="4" w16cid:durableId="807359608">
     <w:abstractNumId w:val="0"/>
   </w:num>
-  <w:num w:numId="2" w16cid:durableId="555240746">
-    <w:abstractNumId w:val="3"/>
-  </w:num>
-  <w:num w:numId="3" w16cid:durableId="2074428222">
+  <w:num w:numId="5" w16cid:durableId="208999524">
     <w:abstractNumId w:val="1"/>
-  </w:num>
-  <w:num w:numId="4" w16cid:durableId="2022390920">
-    <w:abstractNumId w:val="4"/>
-  </w:num>
-  <w:num w:numId="5" w16cid:durableId="168297858">
-    <w:abstractNumId w:val="2"/>
   </w:num>
 </w:numbering>
 </file>

</xml_diff>